<commit_message>
did unity for functional analysis
</commit_message>
<xml_diff>
--- a/Presentation/FunctionalAnalysisFinal.docx
+++ b/Presentation/FunctionalAnalysisFinal.docx
@@ -94,7 +94,7 @@
               </wp:anchor>
             </w:drawing>
           </mc:Choice>
-          <mc:Fallback xmlns="">
+          <mc:Fallback>
             <w:pict>
               <v:shapetype w14:anchorId="1BF7ECCC" id="_x0000_t202" coordsize="21600,21600" o:spt="202" path="m,l,21600r21600,l21600,xe">
                 <v:stroke joinstyle="miter"/>
@@ -329,7 +329,7 @@
               </wp:anchor>
             </w:drawing>
           </mc:Choice>
-          <mc:Fallback xmlns="">
+          <mc:Fallback>
             <w:pict>
               <v:group w14:anchorId="504F966A" id="Group 5516" o:spid="_x0000_s1027" style="position:absolute;left:0;text-align:left;margin-left:0;margin-top:0;width:594.95pt;height:842.05pt;z-index:251650048;mso-position-horizontal-relative:page;mso-position-vertical-relative:page" coordsize="75559,106939" o:gfxdata="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">
                 <v:rect id="Rectangle 6" o:spid="_x0000_s1028" style="position:absolute;left:4572;top:3806;width:351;height:1467;visibility:visible;mso-wrap-style:square;v-text-anchor:top" o:gfxdata="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" filled="f" stroked="f">
@@ -475,7 +475,7 @@
               <w:rFonts w:asciiTheme="minorHAnsi" w:eastAsiaTheme="minorEastAsia" w:hAnsiTheme="minorHAnsi" w:cstheme="minorBidi"/>
               <w:noProof/>
               <w:color w:val="auto"/>
-              <w:lang w:val="en-BE" w:eastAsia="en-BE"/>
+              <w:lang/>
             </w:rPr>
           </w:pPr>
           <w:r>
@@ -565,7 +565,7 @@
               <w:rFonts w:asciiTheme="minorHAnsi" w:eastAsiaTheme="minorEastAsia" w:hAnsiTheme="minorHAnsi" w:cstheme="minorBidi"/>
               <w:noProof/>
               <w:color w:val="auto"/>
-              <w:lang w:val="en-BE" w:eastAsia="en-BE"/>
+              <w:lang/>
             </w:rPr>
           </w:pPr>
           <w:hyperlink w:anchor="_Toc188880814" w:history="1">
@@ -637,7 +637,7 @@
               <w:rFonts w:asciiTheme="minorHAnsi" w:eastAsiaTheme="minorEastAsia" w:hAnsiTheme="minorHAnsi" w:cstheme="minorBidi"/>
               <w:noProof/>
               <w:color w:val="auto"/>
-              <w:lang w:val="en-BE" w:eastAsia="en-BE"/>
+              <w:lang/>
             </w:rPr>
           </w:pPr>
           <w:hyperlink w:anchor="_Toc188880815" w:history="1">
@@ -709,7 +709,7 @@
               <w:rFonts w:asciiTheme="minorHAnsi" w:eastAsiaTheme="minorEastAsia" w:hAnsiTheme="minorHAnsi" w:cstheme="minorBidi"/>
               <w:noProof/>
               <w:color w:val="auto"/>
-              <w:lang w:val="en-BE" w:eastAsia="en-BE"/>
+              <w:lang/>
             </w:rPr>
           </w:pPr>
           <w:hyperlink w:anchor="_Toc188880816" w:history="1">
@@ -781,7 +781,7 @@
               <w:rFonts w:asciiTheme="minorHAnsi" w:eastAsiaTheme="minorEastAsia" w:hAnsiTheme="minorHAnsi" w:cstheme="minorBidi"/>
               <w:noProof/>
               <w:color w:val="auto"/>
-              <w:lang w:val="en-BE" w:eastAsia="en-BE"/>
+              <w:lang/>
             </w:rPr>
           </w:pPr>
           <w:hyperlink w:anchor="_Toc188880817" w:history="1">
@@ -853,7 +853,7 @@
               <w:rFonts w:asciiTheme="minorHAnsi" w:eastAsiaTheme="minorEastAsia" w:hAnsiTheme="minorHAnsi" w:cstheme="minorBidi"/>
               <w:noProof/>
               <w:color w:val="auto"/>
-              <w:lang w:val="en-BE" w:eastAsia="en-BE"/>
+              <w:lang/>
             </w:rPr>
           </w:pPr>
           <w:hyperlink w:anchor="_Toc188880818" w:history="1">
@@ -925,7 +925,7 @@
               <w:rFonts w:asciiTheme="minorHAnsi" w:eastAsiaTheme="minorEastAsia" w:hAnsiTheme="minorHAnsi" w:cstheme="minorBidi"/>
               <w:noProof/>
               <w:color w:val="auto"/>
-              <w:lang w:val="en-BE" w:eastAsia="en-BE"/>
+              <w:lang/>
             </w:rPr>
           </w:pPr>
           <w:hyperlink w:anchor="_Toc188880819" w:history="1">
@@ -997,7 +997,7 @@
               <w:rFonts w:asciiTheme="minorHAnsi" w:eastAsiaTheme="minorEastAsia" w:hAnsiTheme="minorHAnsi" w:cstheme="minorBidi"/>
               <w:noProof/>
               <w:color w:val="auto"/>
-              <w:lang w:val="en-BE" w:eastAsia="en-BE"/>
+              <w:lang/>
             </w:rPr>
           </w:pPr>
           <w:hyperlink w:anchor="_Toc188880820" w:history="1">
@@ -1069,7 +1069,7 @@
               <w:rFonts w:asciiTheme="minorHAnsi" w:eastAsiaTheme="minorEastAsia" w:hAnsiTheme="minorHAnsi" w:cstheme="minorBidi"/>
               <w:noProof/>
               <w:color w:val="auto"/>
-              <w:lang w:val="en-BE" w:eastAsia="en-BE"/>
+              <w:lang/>
             </w:rPr>
           </w:pPr>
           <w:hyperlink w:anchor="_Toc188880821" w:history="1">
@@ -1141,7 +1141,7 @@
               <w:rFonts w:asciiTheme="minorHAnsi" w:eastAsiaTheme="minorEastAsia" w:hAnsiTheme="minorHAnsi" w:cstheme="minorBidi"/>
               <w:noProof/>
               <w:color w:val="auto"/>
-              <w:lang w:val="en-BE" w:eastAsia="en-BE"/>
+              <w:lang/>
             </w:rPr>
           </w:pPr>
           <w:hyperlink w:anchor="_Toc188880822" w:history="1">
@@ -1213,7 +1213,7 @@
               <w:rFonts w:asciiTheme="minorHAnsi" w:eastAsiaTheme="minorEastAsia" w:hAnsiTheme="minorHAnsi" w:cstheme="minorBidi"/>
               <w:noProof/>
               <w:color w:val="auto"/>
-              <w:lang w:val="en-BE" w:eastAsia="en-BE"/>
+              <w:lang/>
             </w:rPr>
           </w:pPr>
           <w:hyperlink w:anchor="_Toc188880823" w:history="1">
@@ -1285,7 +1285,7 @@
               <w:rFonts w:asciiTheme="minorHAnsi" w:eastAsiaTheme="minorEastAsia" w:hAnsiTheme="minorHAnsi" w:cstheme="minorBidi"/>
               <w:noProof/>
               <w:color w:val="auto"/>
-              <w:lang w:val="en-BE" w:eastAsia="en-BE"/>
+              <w:lang/>
             </w:rPr>
           </w:pPr>
           <w:hyperlink w:anchor="_Toc188880824" w:history="1">
@@ -1357,7 +1357,7 @@
               <w:rFonts w:asciiTheme="minorHAnsi" w:eastAsiaTheme="minorEastAsia" w:hAnsiTheme="minorHAnsi" w:cstheme="minorBidi"/>
               <w:noProof/>
               <w:color w:val="auto"/>
-              <w:lang w:val="en-BE" w:eastAsia="en-BE"/>
+              <w:lang/>
             </w:rPr>
           </w:pPr>
           <w:hyperlink w:anchor="_Toc188880825" w:history="1">
@@ -1429,7 +1429,7 @@
               <w:rFonts w:asciiTheme="minorHAnsi" w:eastAsiaTheme="minorEastAsia" w:hAnsiTheme="minorHAnsi" w:cstheme="minorBidi"/>
               <w:noProof/>
               <w:color w:val="auto"/>
-              <w:lang w:val="en-BE" w:eastAsia="en-BE"/>
+              <w:lang/>
             </w:rPr>
           </w:pPr>
           <w:hyperlink w:anchor="_Toc188880826" w:history="1">
@@ -1501,7 +1501,7 @@
               <w:rFonts w:asciiTheme="minorHAnsi" w:eastAsiaTheme="minorEastAsia" w:hAnsiTheme="minorHAnsi" w:cstheme="minorBidi"/>
               <w:noProof/>
               <w:color w:val="auto"/>
-              <w:lang w:val="en-BE" w:eastAsia="en-BE"/>
+              <w:lang/>
             </w:rPr>
           </w:pPr>
           <w:hyperlink w:anchor="_Toc188880827" w:history="1">
@@ -1573,7 +1573,7 @@
               <w:rFonts w:asciiTheme="minorHAnsi" w:eastAsiaTheme="minorEastAsia" w:hAnsiTheme="minorHAnsi" w:cstheme="minorBidi"/>
               <w:noProof/>
               <w:color w:val="auto"/>
-              <w:lang w:val="en-BE" w:eastAsia="en-BE"/>
+              <w:lang/>
             </w:rPr>
           </w:pPr>
           <w:hyperlink w:anchor="_Toc188880828" w:history="1">
@@ -1645,7 +1645,7 @@
               <w:rFonts w:asciiTheme="minorHAnsi" w:eastAsiaTheme="minorEastAsia" w:hAnsiTheme="minorHAnsi" w:cstheme="minorBidi"/>
               <w:noProof/>
               <w:color w:val="auto"/>
-              <w:lang w:val="en-BE" w:eastAsia="en-BE"/>
+              <w:lang/>
             </w:rPr>
           </w:pPr>
           <w:hyperlink w:anchor="_Toc188880829" w:history="1">
@@ -1717,7 +1717,7 @@
               <w:rFonts w:asciiTheme="minorHAnsi" w:eastAsiaTheme="minorEastAsia" w:hAnsiTheme="minorHAnsi" w:cstheme="minorBidi"/>
               <w:noProof/>
               <w:color w:val="auto"/>
-              <w:lang w:val="en-BE" w:eastAsia="en-BE"/>
+              <w:lang/>
             </w:rPr>
           </w:pPr>
           <w:hyperlink w:anchor="_Toc188880830" w:history="1">
@@ -1789,7 +1789,7 @@
               <w:rFonts w:asciiTheme="minorHAnsi" w:eastAsiaTheme="minorEastAsia" w:hAnsiTheme="minorHAnsi" w:cstheme="minorBidi"/>
               <w:noProof/>
               <w:color w:val="auto"/>
-              <w:lang w:val="en-BE" w:eastAsia="en-BE"/>
+              <w:lang/>
             </w:rPr>
           </w:pPr>
           <w:hyperlink w:anchor="_Toc188880831" w:history="1">
@@ -1861,7 +1861,7 @@
               <w:rFonts w:asciiTheme="minorHAnsi" w:eastAsiaTheme="minorEastAsia" w:hAnsiTheme="minorHAnsi" w:cstheme="minorBidi"/>
               <w:noProof/>
               <w:color w:val="auto"/>
-              <w:lang w:val="en-BE" w:eastAsia="en-BE"/>
+              <w:lang/>
             </w:rPr>
           </w:pPr>
           <w:hyperlink w:anchor="_Toc188880832" w:history="1">
@@ -1933,7 +1933,7 @@
               <w:rFonts w:asciiTheme="minorHAnsi" w:eastAsiaTheme="minorEastAsia" w:hAnsiTheme="minorHAnsi" w:cstheme="minorBidi"/>
               <w:noProof/>
               <w:color w:val="auto"/>
-              <w:lang w:val="en-BE" w:eastAsia="en-BE"/>
+              <w:lang/>
             </w:rPr>
           </w:pPr>
           <w:hyperlink w:anchor="_Toc188880833" w:history="1">
@@ -2005,7 +2005,7 @@
               <w:rFonts w:asciiTheme="minorHAnsi" w:eastAsiaTheme="minorEastAsia" w:hAnsiTheme="minorHAnsi" w:cstheme="minorBidi"/>
               <w:noProof/>
               <w:color w:val="auto"/>
-              <w:lang w:val="en-BE" w:eastAsia="en-BE"/>
+              <w:lang/>
             </w:rPr>
           </w:pPr>
           <w:hyperlink w:anchor="_Toc188880834" w:history="1">
@@ -2077,7 +2077,7 @@
               <w:rFonts w:asciiTheme="minorHAnsi" w:eastAsiaTheme="minorEastAsia" w:hAnsiTheme="minorHAnsi" w:cstheme="minorBidi"/>
               <w:noProof/>
               <w:color w:val="auto"/>
-              <w:lang w:val="en-BE" w:eastAsia="en-BE"/>
+              <w:lang/>
             </w:rPr>
           </w:pPr>
           <w:hyperlink w:anchor="_Toc188880835" w:history="1">
@@ -2149,7 +2149,7 @@
               <w:rFonts w:asciiTheme="minorHAnsi" w:eastAsiaTheme="minorEastAsia" w:hAnsiTheme="minorHAnsi" w:cstheme="minorBidi"/>
               <w:noProof/>
               <w:color w:val="auto"/>
-              <w:lang w:val="en-BE" w:eastAsia="en-BE"/>
+              <w:lang/>
             </w:rPr>
           </w:pPr>
           <w:hyperlink w:anchor="_Toc188880836" w:history="1">
@@ -2258,7 +2258,6 @@
         <w:br w:type="page"/>
       </w:r>
     </w:p>
-    <w:bookmarkStart w:id="0" w:name="_Toc188880813"/>
     <w:p>
       <w:pPr>
         <w:pStyle w:val="Heading1"/>
@@ -2270,6 +2269,7 @@
           <w:lang w:val="en-GB"/>
         </w:rPr>
       </w:pPr>
+      <w:bookmarkStart w:id="0" w:name="_Toc188880813"/>
       <w:r>
         <w:rPr>
           <w:rFonts w:ascii="Arial" w:eastAsia="Arial" w:hAnsi="Arial" w:cs="Arial"/>
@@ -2426,7 +2426,7 @@
               </wp:anchor>
             </w:drawing>
           </mc:Choice>
-          <mc:Fallback xmlns="">
+          <mc:Fallback>
             <w:pict>
               <v:shape w14:anchorId="422787AC" id="Text Box 7" o:spid="_x0000_s1033" type="#_x0000_t202" style="position:absolute;left:0;text-align:left;margin-left:8.85pt;margin-top:257.3pt;width:189.8pt;height:132.8pt;z-index:251654144;visibility:visible;mso-wrap-style:square;mso-width-percent:0;mso-height-percent:0;mso-wrap-distance-left:9pt;mso-wrap-distance-top:0;mso-wrap-distance-right:9pt;mso-wrap-distance-bottom:0;mso-position-horizontal:absolute;mso-position-horizontal-relative:text;mso-position-vertical:absolute;mso-position-vertical-relative:text;mso-width-percent:0;mso-height-percent:0;mso-width-relative:margin;mso-height-relative:margin;v-text-anchor:top" o:gfxdata="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" fillcolor="white [3201]" stroked="f" strokeweight=".5pt">
                 <v:textbox>
@@ -2770,7 +2770,7 @@
               </wp:anchor>
             </w:drawing>
           </mc:Choice>
-          <mc:Fallback xmlns="">
+          <mc:Fallback>
             <w:pict>
               <v:shape w14:anchorId="28E06EC5" id="_x0000_s1034" type="#_x0000_t202" style="position:absolute;left:0;text-align:left;margin-left:0;margin-top:319.5pt;width:102.85pt;height:28.05pt;z-index:251659264;visibility:visible;mso-wrap-style:square;mso-width-percent:0;mso-height-percent:0;mso-wrap-distance-left:9pt;mso-wrap-distance-top:0;mso-wrap-distance-right:9pt;mso-wrap-distance-bottom:0;mso-position-horizontal:center;mso-position-horizontal-relative:margin;mso-position-vertical:absolute;mso-position-vertical-relative:text;mso-width-percent:0;mso-height-percent:0;mso-width-relative:margin;mso-height-relative:margin;v-text-anchor:top" o:gfxdata="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" fillcolor="white [3201]" stroked="f" strokeweight=".5pt">
                 <v:textbox>
@@ -2958,7 +2958,7 @@
               </wp:anchor>
             </w:drawing>
           </mc:Choice>
-          <mc:Fallback xmlns="">
+          <mc:Fallback>
             <w:pict>
               <v:shape w14:anchorId="28B35F0E" id="_x0000_s1035" type="#_x0000_t202" style="position:absolute;left:0;text-align:left;margin-left:63.5pt;margin-top:21.2pt;width:73.85pt;height:28.05pt;z-index:251657216;visibility:visible;mso-wrap-style:square;mso-width-percent:0;mso-height-percent:0;mso-wrap-distance-left:9pt;mso-wrap-distance-top:0;mso-wrap-distance-right:9pt;mso-wrap-distance-bottom:0;mso-position-horizontal:absolute;mso-position-horizontal-relative:margin;mso-position-vertical:absolute;mso-position-vertical-relative:text;mso-width-percent:0;mso-height-percent:0;mso-width-relative:margin;mso-height-relative:margin;v-text-anchor:top" o:gfxdata="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" fillcolor="white [3201]" stroked="f" strokeweight=".5pt">
                 <v:textbox>
@@ -3079,7 +3079,7 @@
               </wp:anchor>
             </w:drawing>
           </mc:Choice>
-          <mc:Fallback xmlns="">
+          <mc:Fallback>
             <w:pict>
               <v:shape w14:anchorId="0BDCED74" id="_x0000_s1036" type="#_x0000_t202" style="position:absolute;left:0;text-align:left;margin-left:390.2pt;margin-top:23.85pt;width:73.85pt;height:28.05pt;z-index:251658240;visibility:visible;mso-wrap-style:square;mso-width-percent:0;mso-height-percent:0;mso-wrap-distance-left:9pt;mso-wrap-distance-top:0;mso-wrap-distance-right:9pt;mso-wrap-distance-bottom:0;mso-position-horizontal:absolute;mso-position-horizontal-relative:margin;mso-position-vertical:absolute;mso-position-vertical-relative:text;mso-width-percent:0;mso-height-percent:0;mso-width-relative:margin;mso-height-relative:margin;v-text-anchor:top" o:gfxdata="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" fillcolor="white [3201]" stroked="f" strokeweight=".5pt">
                 <v:textbox>
@@ -3232,7 +3232,7 @@
               </wp:anchor>
             </w:drawing>
           </mc:Choice>
-          <mc:Fallback xmlns="">
+          <mc:Fallback>
             <w:pict>
               <v:shape w14:anchorId="50128268" id="_x0000_s1037" type="#_x0000_t202" style="position:absolute;left:0;text-align:left;margin-left:337.95pt;margin-top:240.9pt;width:189.8pt;height:75.75pt;z-index:251655168;visibility:visible;mso-wrap-style:square;mso-width-percent:0;mso-height-percent:0;mso-wrap-distance-left:9pt;mso-wrap-distance-top:0;mso-wrap-distance-right:9pt;mso-wrap-distance-bottom:0;mso-position-horizontal:absolute;mso-position-horizontal-relative:text;mso-position-vertical:absolute;mso-position-vertical-relative:text;mso-width-percent:0;mso-height-percent:0;mso-width-relative:margin;mso-height-relative:margin;v-text-anchor:top" o:gfxdata="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" fillcolor="white [3201]" stroked="f" strokeweight=".5pt">
                 <v:textbox>
@@ -3452,7 +3452,7 @@
               </wp:anchor>
             </w:drawing>
           </mc:Choice>
-          <mc:Fallback xmlns="">
+          <mc:Fallback>
             <w:pict>
               <v:shape w14:anchorId="71367D6C" id="_x0000_s1038" type="#_x0000_t202" style="position:absolute;left:0;text-align:left;margin-left:0;margin-top:536.25pt;width:189.8pt;height:132.8pt;z-index:251656192;visibility:visible;mso-wrap-style:square;mso-width-percent:0;mso-height-percent:0;mso-wrap-distance-left:9pt;mso-wrap-distance-top:0;mso-wrap-distance-right:9pt;mso-wrap-distance-bottom:0;mso-position-horizontal:center;mso-position-horizontal-relative:margin;mso-position-vertical:absolute;mso-position-vertical-relative:text;mso-width-percent:0;mso-height-percent:0;mso-width-relative:margin;mso-height-relative:margin;v-text-anchor:top" o:gfxdata="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" fillcolor="white [3201]" stroked="f" strokeweight=".5pt">
                 <v:textbox>
@@ -3937,20 +3937,20 @@
           <w:numId w:val="36"/>
         </w:numPr>
         <w:rPr>
-          <w:lang w:val="en-BE"/>
+          <w:lang/>
         </w:rPr>
       </w:pPr>
       <w:r>
         <w:rPr>
           <w:b/>
           <w:bCs/>
-          <w:lang w:val="en-BE"/>
+          <w:lang/>
         </w:rPr>
         <w:t>Continent Selection &amp; Voice Input</w:t>
       </w:r>
       <w:r>
         <w:rPr>
-          <w:lang w:val="en-BE"/>
+          <w:lang/>
         </w:rPr>
         <w:t>:</w:t>
       </w:r>
@@ -3965,12 +3965,12 @@
           <w:tab w:val="num" w:pos="720"/>
         </w:tabs>
         <w:rPr>
-          <w:lang w:val="en-BE"/>
-        </w:rPr>
-      </w:pPr>
-      <w:r>
-        <w:rPr>
-          <w:lang w:val="en-BE"/>
+          <w:lang/>
+        </w:rPr>
+      </w:pPr>
+      <w:r>
+        <w:rPr>
+          <w:lang/>
         </w:rPr>
         <w:t>Users can select a continent via a navigation screen.</w:t>
       </w:r>
@@ -3985,12 +3985,12 @@
           <w:tab w:val="num" w:pos="720"/>
         </w:tabs>
         <w:rPr>
-          <w:lang w:val="en-BE"/>
-        </w:rPr>
-      </w:pPr>
-      <w:r>
-        <w:rPr>
-          <w:lang w:val="en-BE"/>
+          <w:lang/>
+        </w:rPr>
+      </w:pPr>
+      <w:r>
+        <w:rPr>
+          <w:lang/>
         </w:rPr>
         <w:t>An optional voice input feature enhances the immersive experience.</w:t>
       </w:r>
@@ -4003,20 +4003,20 @@
           <w:numId w:val="36"/>
         </w:numPr>
         <w:rPr>
-          <w:lang w:val="en-BE"/>
+          <w:lang/>
         </w:rPr>
       </w:pPr>
       <w:r>
         <w:rPr>
           <w:b/>
           <w:bCs/>
-          <w:lang w:val="en-BE"/>
+          <w:lang/>
         </w:rPr>
         <w:t>Immersive Visuals</w:t>
       </w:r>
       <w:r>
         <w:rPr>
-          <w:lang w:val="en-BE"/>
+          <w:lang/>
         </w:rPr>
         <w:t>:</w:t>
       </w:r>
@@ -4028,12 +4028,12 @@
           <w:numId w:val="37"/>
         </w:numPr>
         <w:rPr>
-          <w:lang w:val="en-BE"/>
-        </w:rPr>
-      </w:pPr>
-      <w:r>
-        <w:rPr>
-          <w:lang w:val="en-BE"/>
+          <w:lang/>
+        </w:rPr>
+      </w:pPr>
+      <w:r>
+        <w:rPr>
+          <w:lang/>
         </w:rPr>
         <w:t>Images are displayed seamlessly across all four walls of the immersive room.</w:t>
       </w:r>
@@ -4045,12 +4045,12 @@
           <w:numId w:val="37"/>
         </w:numPr>
         <w:rPr>
-          <w:lang w:val="en-BE"/>
-        </w:rPr>
-      </w:pPr>
-      <w:r>
-        <w:rPr>
-          <w:lang w:val="en-BE"/>
+          <w:lang/>
+        </w:rPr>
+      </w:pPr>
+      <w:r>
+        <w:rPr>
+          <w:lang/>
         </w:rPr>
         <w:t>Images must be high resolution, appropriately scaled, and accurately sized.</w:t>
       </w:r>
@@ -4063,20 +4063,20 @@
           <w:numId w:val="36"/>
         </w:numPr>
         <w:rPr>
-          <w:lang w:val="en-BE"/>
+          <w:lang/>
         </w:rPr>
       </w:pPr>
       <w:r>
         <w:rPr>
           <w:b/>
           <w:bCs/>
-          <w:lang w:val="en-BE"/>
+          <w:lang/>
         </w:rPr>
         <w:t>Audio Experience</w:t>
       </w:r>
       <w:r>
         <w:rPr>
-          <w:lang w:val="en-BE"/>
+          <w:lang/>
         </w:rPr>
         <w:t>:</w:t>
       </w:r>
@@ -4088,12 +4088,12 @@
           <w:numId w:val="34"/>
         </w:numPr>
         <w:rPr>
-          <w:lang w:val="en-BE"/>
-        </w:rPr>
-      </w:pPr>
-      <w:r>
-        <w:rPr>
-          <w:lang w:val="en-BE"/>
+          <w:lang/>
+        </w:rPr>
+      </w:pPr>
+      <w:r>
+        <w:rPr>
+          <w:lang/>
         </w:rPr>
         <w:t>Relevant sounds or music must accompany the images to heighten immersion.</w:t>
       </w:r>
@@ -4106,20 +4106,20 @@
           <w:numId w:val="36"/>
         </w:numPr>
         <w:rPr>
-          <w:lang w:val="en-BE"/>
+          <w:lang/>
         </w:rPr>
       </w:pPr>
       <w:r>
         <w:rPr>
           <w:b/>
           <w:bCs/>
-          <w:lang w:val="en-BE"/>
+          <w:lang/>
         </w:rPr>
         <w:t>AI-Generated Images</w:t>
       </w:r>
       <w:r>
         <w:rPr>
-          <w:lang w:val="en-BE"/>
+          <w:lang/>
         </w:rPr>
         <w:t>:</w:t>
       </w:r>
@@ -4131,12 +4131,12 @@
           <w:numId w:val="35"/>
         </w:numPr>
         <w:rPr>
-          <w:lang w:val="en-BE"/>
-        </w:rPr>
-      </w:pPr>
-      <w:r>
-        <w:rPr>
-          <w:lang w:val="en-BE"/>
+          <w:lang/>
+        </w:rPr>
+      </w:pPr>
+      <w:r>
+        <w:rPr>
+          <w:lang/>
         </w:rPr>
         <w:t>All images must be AI-generated.</w:t>
       </w:r>
@@ -4148,12 +4148,12 @@
           <w:numId w:val="35"/>
         </w:numPr>
         <w:rPr>
-          <w:lang w:val="en-BE"/>
-        </w:rPr>
-      </w:pPr>
-      <w:r>
-        <w:rPr>
-          <w:lang w:val="en-BE"/>
+          <w:lang/>
+        </w:rPr>
+      </w:pPr>
+      <w:r>
+        <w:rPr>
+          <w:lang/>
         </w:rPr>
         <w:t>Pregenerated images should match the selected continent and voice input.</w:t>
       </w:r>
@@ -4165,12 +4165,12 @@
           <w:numId w:val="35"/>
         </w:numPr>
         <w:rPr>
-          <w:lang w:val="en-BE"/>
-        </w:rPr>
-      </w:pPr>
-      <w:r>
-        <w:rPr>
-          <w:lang w:val="en-BE"/>
+          <w:lang/>
+        </w:rPr>
+      </w:pPr>
+      <w:r>
+        <w:rPr>
+          <w:lang/>
         </w:rPr>
         <w:t>On-the-spot image generation must occur within an acceptable timeframe.</w:t>
       </w:r>
@@ -4182,24 +4182,24 @@
           <w:numId w:val="35"/>
         </w:numPr>
         <w:rPr>
-          <w:lang w:val="en-BE"/>
-        </w:rPr>
-      </w:pPr>
-      <w:r>
-        <w:rPr>
-          <w:lang w:val="en-BE"/>
+          <w:lang/>
+        </w:rPr>
+      </w:pPr>
+      <w:r>
+        <w:rPr>
+          <w:lang/>
         </w:rPr>
         <w:t xml:space="preserve">The AI model used for image generation must be free </w:t>
       </w:r>
       <w:r>
         <w:rPr>
-          <w:lang w:val="en-BE"/>
+          <w:lang/>
         </w:rPr>
         <w:t>for non-commercial use</w:t>
       </w:r>
       <w:r>
         <w:rPr>
-          <w:lang w:val="en-BE"/>
+          <w:lang/>
         </w:rPr>
         <w:t>.</w:t>
       </w:r>
@@ -4207,7 +4207,7 @@
     <w:p>
       <w:pPr>
         <w:rPr>
-          <w:lang w:val="en-BE"/>
+          <w:lang/>
         </w:rPr>
       </w:pPr>
     </w:p>
@@ -4265,20 +4265,20 @@
           <w:numId w:val="41"/>
         </w:numPr>
         <w:rPr>
-          <w:lang w:val="en-BE"/>
+          <w:lang/>
         </w:rPr>
       </w:pPr>
       <w:r>
         <w:rPr>
           <w:b/>
           <w:bCs/>
-          <w:lang w:val="en-BE"/>
+          <w:lang/>
         </w:rPr>
         <w:t>Alternative Interface</w:t>
       </w:r>
       <w:r>
         <w:rPr>
-          <w:lang w:val="en-BE"/>
+          <w:lang/>
         </w:rPr>
         <w:t>:</w:t>
       </w:r>
@@ -4293,12 +4293,12 @@
           <w:tab w:val="num" w:pos="720"/>
         </w:tabs>
         <w:rPr>
-          <w:lang w:val="en-BE"/>
-        </w:rPr>
-      </w:pPr>
-      <w:r>
-        <w:rPr>
-          <w:lang w:val="en-BE"/>
+          <w:lang/>
+        </w:rPr>
+      </w:pPr>
+      <w:r>
+        <w:rPr>
+          <w:lang/>
         </w:rPr>
         <w:t>Allow users to interact with the system via a tablet or phone instead of a keyboard.</w:t>
       </w:r>
@@ -4311,20 +4311,20 @@
           <w:numId w:val="41"/>
         </w:numPr>
         <w:rPr>
-          <w:lang w:val="en-BE"/>
+          <w:lang/>
         </w:rPr>
       </w:pPr>
       <w:r>
         <w:rPr>
           <w:b/>
           <w:bCs/>
-          <w:lang w:val="en-BE"/>
+          <w:lang/>
         </w:rPr>
         <w:t>Advanced Image Search</w:t>
       </w:r>
       <w:r>
         <w:rPr>
-          <w:lang w:val="en-BE"/>
+          <w:lang/>
         </w:rPr>
         <w:t>:</w:t>
       </w:r>
@@ -4339,12 +4339,12 @@
           <w:tab w:val="num" w:pos="720"/>
         </w:tabs>
         <w:rPr>
-          <w:lang w:val="en-BE"/>
-        </w:rPr>
-      </w:pPr>
-      <w:r>
-        <w:rPr>
-          <w:lang w:val="en-BE"/>
+          <w:lang/>
+        </w:rPr>
+      </w:pPr>
+      <w:r>
+        <w:rPr>
+          <w:lang/>
         </w:rPr>
         <w:t>Provide full-text search with fuzziness to locate pregenerated images that approximate the voice input.</w:t>
       </w:r>
@@ -4357,12 +4357,12 @@
           <w:numId w:val="41"/>
         </w:numPr>
         <w:rPr>
-          <w:lang w:val="en-BE"/>
-        </w:rPr>
-      </w:pPr>
-      <w:r>
-        <w:rPr>
-          <w:lang w:val="en-BE"/>
+          <w:lang/>
+        </w:rPr>
+      </w:pPr>
+      <w:r>
+        <w:rPr>
+          <w:lang/>
         </w:rPr>
         <w:t xml:space="preserve"> </w:t>
       </w:r>
@@ -4370,13 +4370,13 @@
         <w:rPr>
           <w:b/>
           <w:bCs/>
-          <w:lang w:val="en-BE"/>
+          <w:lang/>
         </w:rPr>
         <w:t>AI-Generated Audio</w:t>
       </w:r>
       <w:r>
         <w:rPr>
-          <w:lang w:val="en-BE"/>
+          <w:lang/>
         </w:rPr>
         <w:t>:</w:t>
       </w:r>
@@ -4388,12 +4388,12 @@
           <w:numId w:val="40"/>
         </w:numPr>
         <w:rPr>
-          <w:lang w:val="en-BE"/>
-        </w:rPr>
-      </w:pPr>
-      <w:r>
-        <w:rPr>
-          <w:lang w:val="en-BE"/>
+          <w:lang/>
+        </w:rPr>
+      </w:pPr>
+      <w:r>
+        <w:rPr>
+          <w:lang/>
         </w:rPr>
         <w:t>Leverage AI to create custom music or ambient sounds for enhanced user engagement.</w:t>
       </w:r>
@@ -4401,7 +4401,7 @@
     <w:p>
       <w:pPr>
         <w:rPr>
-          <w:lang w:val="en-BE"/>
+          <w:lang/>
         </w:rPr>
       </w:pPr>
     </w:p>
@@ -4447,20 +4447,20 @@
           <w:numId w:val="44"/>
         </w:numPr>
         <w:rPr>
-          <w:lang w:val="en-BE"/>
+          <w:lang/>
         </w:rPr>
       </w:pPr>
       <w:r>
         <w:rPr>
           <w:b/>
           <w:bCs/>
-          <w:lang w:val="en-BE"/>
+          <w:lang/>
         </w:rPr>
         <w:t>Video/Animation Limitations</w:t>
       </w:r>
       <w:r>
         <w:rPr>
-          <w:lang w:val="en-BE"/>
+          <w:lang/>
         </w:rPr>
         <w:t>:</w:t>
       </w:r>
@@ -4475,20 +4475,20 @@
           <w:tab w:val="num" w:pos="720"/>
         </w:tabs>
         <w:rPr>
-          <w:lang w:val="en-BE"/>
+          <w:lang/>
         </w:rPr>
       </w:pPr>
       <w:r>
         <w:rPr>
           <w:b/>
           <w:bCs/>
-          <w:lang w:val="en-BE"/>
+          <w:lang/>
         </w:rPr>
         <w:t xml:space="preserve">Problem: </w:t>
       </w:r>
       <w:r>
         <w:rPr>
-          <w:lang w:val="en-BE"/>
+          <w:lang/>
         </w:rPr>
         <w:t>Combining videos or animations with free models within an acceptable waiting time (under 2 minutes) is not feasible.</w:t>
       </w:r>
@@ -4503,20 +4503,20 @@
           <w:tab w:val="num" w:pos="720"/>
         </w:tabs>
         <w:rPr>
-          <w:lang w:val="en-BE"/>
+          <w:lang/>
         </w:rPr>
       </w:pPr>
       <w:r>
         <w:rPr>
           <w:b/>
           <w:bCs/>
-          <w:lang w:val="en-BE"/>
+          <w:lang/>
         </w:rPr>
         <w:t>Solution</w:t>
       </w:r>
       <w:r>
         <w:rPr>
-          <w:lang w:val="en-BE"/>
+          <w:lang/>
         </w:rPr>
         <w:t>: Engage the customer in discussions about their preferences:</w:t>
       </w:r>
@@ -4531,12 +4531,12 @@
           <w:tab w:val="num" w:pos="1440"/>
         </w:tabs>
         <w:rPr>
-          <w:lang w:val="en-BE"/>
-        </w:rPr>
-      </w:pPr>
-      <w:r>
-        <w:rPr>
-          <w:lang w:val="en-BE"/>
+          <w:lang/>
+        </w:rPr>
+      </w:pPr>
+      <w:r>
+        <w:rPr>
+          <w:lang/>
         </w:rPr>
         <w:t>Free models → static images.</w:t>
       </w:r>
@@ -4551,12 +4551,12 @@
           <w:tab w:val="num" w:pos="1440"/>
         </w:tabs>
         <w:rPr>
-          <w:lang w:val="en-BE"/>
-        </w:rPr>
-      </w:pPr>
-      <w:r>
-        <w:rPr>
-          <w:lang w:val="en-BE"/>
+          <w:lang/>
+        </w:rPr>
+      </w:pPr>
+      <w:r>
+        <w:rPr>
+          <w:lang/>
         </w:rPr>
         <w:t>Paid models → animations or videos.</w:t>
       </w:r>
@@ -4571,20 +4571,20 @@
           <w:tab w:val="num" w:pos="720"/>
         </w:tabs>
         <w:rPr>
-          <w:lang w:val="en-BE"/>
+          <w:lang/>
         </w:rPr>
       </w:pPr>
       <w:r>
         <w:rPr>
           <w:b/>
           <w:bCs/>
-          <w:lang w:val="en-BE"/>
+          <w:lang/>
         </w:rPr>
         <w:t>Outcome</w:t>
       </w:r>
       <w:r>
         <w:rPr>
-          <w:lang w:val="en-BE"/>
+          <w:lang/>
         </w:rPr>
         <w:t>: Default to static images unless the customer opts for paid solutions.</w:t>
       </w:r>
@@ -4592,7 +4592,7 @@
     <w:p>
       <w:pPr>
         <w:rPr>
-          <w:lang w:val="en-BE"/>
+          <w:lang/>
         </w:rPr>
       </w:pPr>
     </w:p>
@@ -4606,14 +4606,14 @@
         <w:rPr>
           <w:b/>
           <w:bCs/>
-          <w:lang w:val="en-BE"/>
+          <w:lang/>
         </w:rPr>
       </w:pPr>
       <w:r>
         <w:rPr>
           <w:b/>
           <w:bCs/>
-          <w:lang w:val="en-BE"/>
+          <w:lang/>
         </w:rPr>
         <w:t>Waiting time limitations:</w:t>
       </w:r>
@@ -4628,7 +4628,7 @@
         <w:rPr>
           <w:b/>
           <w:bCs/>
-          <w:lang w:val="en-BE"/>
+          <w:lang/>
         </w:rPr>
       </w:pPr>
       <w:r>
@@ -4652,20 +4652,20 @@
         <w:rPr>
           <w:b/>
           <w:bCs/>
-          <w:lang w:val="en-BE"/>
+          <w:lang/>
         </w:rPr>
       </w:pPr>
       <w:r>
         <w:rPr>
           <w:b/>
           <w:bCs/>
-          <w:lang w:val="en-BE"/>
+          <w:lang/>
         </w:rPr>
         <w:t>Solutions</w:t>
       </w:r>
       <w:r>
         <w:rPr>
-          <w:lang w:val="en-BE"/>
+          <w:lang/>
         </w:rPr>
         <w:t xml:space="preserve">: </w:t>
       </w:r>
@@ -4678,12 +4678,12 @@
           <w:numId w:val="40"/>
         </w:numPr>
         <w:rPr>
-          <w:lang w:val="en-BE"/>
-        </w:rPr>
-      </w:pPr>
-      <w:r>
-        <w:rPr>
-          <w:lang w:val="en-BE"/>
+          <w:lang/>
+        </w:rPr>
+      </w:pPr>
+      <w:r>
+        <w:rPr>
+          <w:lang/>
         </w:rPr>
         <w:t>Switch to running smaller, faster models directly on our machines.</w:t>
       </w:r>
@@ -4698,12 +4698,12 @@
         <w:rPr>
           <w:b/>
           <w:bCs/>
-          <w:lang w:val="en-BE"/>
-        </w:rPr>
-      </w:pPr>
-      <w:r>
-        <w:rPr>
-          <w:lang w:val="en-BE"/>
+          <w:lang/>
+        </w:rPr>
+      </w:pPr>
+      <w:r>
+        <w:rPr>
+          <w:lang/>
         </w:rPr>
         <w:t>Pre-generate a library of images featuring famous landmarks.</w:t>
       </w:r>
@@ -4718,14 +4718,14 @@
         <w:rPr>
           <w:b/>
           <w:bCs/>
-          <w:lang w:val="en-BE"/>
+          <w:lang/>
         </w:rPr>
       </w:pPr>
       <w:r>
         <w:rPr>
           <w:b/>
           <w:bCs/>
-          <w:lang w:val="en-BE"/>
+          <w:lang/>
         </w:rPr>
         <w:t>Outcome</w:t>
       </w:r>
@@ -4733,7 +4733,7 @@
         <w:rPr>
           <w:b/>
           <w:bCs/>
-          <w:lang w:val="en-BE"/>
+          <w:lang/>
         </w:rPr>
         <w:t xml:space="preserve">: </w:t>
       </w:r>
@@ -4746,14 +4746,14 @@
         <w:rPr>
           <w:b/>
           <w:bCs/>
-          <w:lang w:val="en-BE"/>
+          <w:lang/>
         </w:rPr>
       </w:pPr>
       <w:r>
         <w:rPr>
           <w:b/>
           <w:bCs/>
-          <w:lang w:val="en-BE"/>
+          <w:lang/>
         </w:rPr>
         <w:br w:type="page"/>
       </w:r>
@@ -4763,7 +4763,7 @@
         <w:rPr>
           <w:b/>
           <w:bCs/>
-          <w:lang w:val="en-BE"/>
+          <w:lang/>
         </w:rPr>
       </w:pPr>
     </w:p>
@@ -4775,20 +4775,20 @@
           <w:numId w:val="44"/>
         </w:numPr>
         <w:rPr>
-          <w:lang w:val="en-BE"/>
+          <w:lang/>
         </w:rPr>
       </w:pPr>
       <w:r>
         <w:rPr>
           <w:b/>
           <w:bCs/>
-          <w:lang w:val="en-BE"/>
+          <w:lang/>
         </w:rPr>
         <w:t>AI Accuracy Concerns</w:t>
       </w:r>
       <w:r>
         <w:rPr>
-          <w:lang w:val="en-BE"/>
+          <w:lang/>
         </w:rPr>
         <w:t>:</w:t>
       </w:r>
@@ -4803,20 +4803,20 @@
           <w:tab w:val="num" w:pos="720"/>
         </w:tabs>
         <w:rPr>
-          <w:lang w:val="en-BE"/>
+          <w:lang/>
         </w:rPr>
       </w:pPr>
       <w:r>
         <w:rPr>
           <w:b/>
           <w:bCs/>
-          <w:lang w:val="en-BE"/>
+          <w:lang/>
         </w:rPr>
         <w:t xml:space="preserve">Problem: </w:t>
       </w:r>
       <w:r>
         <w:rPr>
-          <w:lang w:val="en-BE"/>
+          <w:lang/>
         </w:rPr>
         <w:t>AI-generated images may lack precision and cannot replace traditional educational study trips.</w:t>
       </w:r>
@@ -4831,20 +4831,20 @@
           <w:tab w:val="num" w:pos="720"/>
         </w:tabs>
         <w:rPr>
-          <w:lang w:val="en-BE"/>
+          <w:lang/>
         </w:rPr>
       </w:pPr>
       <w:r>
         <w:rPr>
           <w:b/>
           <w:bCs/>
-          <w:lang w:val="en-BE"/>
+          <w:lang/>
         </w:rPr>
         <w:t>Solution</w:t>
       </w:r>
       <w:r>
         <w:rPr>
-          <w:lang w:val="en-BE"/>
+          <w:lang/>
         </w:rPr>
         <w:t>: Redefine the educational concept through collaboration with the customer:</w:t>
       </w:r>
@@ -4859,20 +4859,20 @@
           <w:tab w:val="num" w:pos="1440"/>
         </w:tabs>
         <w:rPr>
-          <w:lang w:val="en-BE"/>
+          <w:lang/>
         </w:rPr>
       </w:pPr>
       <w:r>
         <w:rPr>
           <w:b/>
           <w:bCs/>
-          <w:lang w:val="en-BE"/>
+          <w:lang/>
         </w:rPr>
         <w:t>Creative Engagement</w:t>
       </w:r>
       <w:r>
         <w:rPr>
-          <w:lang w:val="en-BE"/>
+          <w:lang/>
         </w:rPr>
         <w:t>: Use AI-generated images to spark creativity and curiosity in children through interactive scenarios.</w:t>
       </w:r>
@@ -4887,20 +4887,20 @@
           <w:tab w:val="num" w:pos="1440"/>
         </w:tabs>
         <w:rPr>
-          <w:lang w:val="en-BE"/>
+          <w:lang/>
         </w:rPr>
       </w:pPr>
       <w:r>
         <w:rPr>
           <w:b/>
           <w:bCs/>
-          <w:lang w:val="en-BE"/>
+          <w:lang/>
         </w:rPr>
         <w:t>Critical Thinking Development</w:t>
       </w:r>
       <w:r>
         <w:rPr>
-          <w:lang w:val="en-BE"/>
+          <w:lang/>
         </w:rPr>
         <w:t>: Foster critical thinking and digital literacy by teaching children to analyze and evaluate AI-generated content, guided by educators.</w:t>
       </w:r>
@@ -4913,7 +4913,7 @@
           <w:numId w:val="43"/>
         </w:numPr>
         <w:rPr>
-          <w:lang w:val="en-BE"/>
+          <w:lang/>
         </w:rPr>
       </w:pPr>
       <w:r>
@@ -4930,7 +4930,7 @@
     <w:p>
       <w:pPr>
         <w:rPr>
-          <w:lang w:val="en-BE"/>
+          <w:lang/>
         </w:rPr>
       </w:pPr>
     </w:p>
@@ -4942,20 +4942,20 @@
           <w:numId w:val="44"/>
         </w:numPr>
         <w:rPr>
-          <w:lang w:val="en-BE"/>
+          <w:lang/>
         </w:rPr>
       </w:pPr>
       <w:r>
         <w:rPr>
           <w:b/>
           <w:bCs/>
-          <w:lang w:val="en-BE"/>
+          <w:lang/>
         </w:rPr>
         <w:t>Inaccurate voice recognition</w:t>
       </w:r>
       <w:r>
         <w:rPr>
-          <w:lang w:val="en-BE"/>
+          <w:lang/>
         </w:rPr>
         <w:t>:</w:t>
       </w:r>
@@ -4968,20 +4968,20 @@
           <w:numId w:val="46"/>
         </w:numPr>
         <w:rPr>
-          <w:lang w:val="en-BE" w:eastAsia="en-BE"/>
+          <w:lang/>
         </w:rPr>
       </w:pPr>
       <w:r>
         <w:rPr>
           <w:b/>
           <w:bCs/>
-          <w:lang w:val="en-BE" w:eastAsia="en-BE"/>
+          <w:lang/>
         </w:rPr>
         <w:t>Problem</w:t>
       </w:r>
       <w:r>
         <w:rPr>
-          <w:lang w:val="en-BE" w:eastAsia="en-BE"/>
+          <w:lang/>
         </w:rPr>
         <w:t>: The website's voice input tool sometimes misinterpreted user speech before sending it to the API.</w:t>
       </w:r>
@@ -4994,20 +4994,20 @@
           <w:numId w:val="46"/>
         </w:numPr>
         <w:rPr>
-          <w:lang w:val="en-BE" w:eastAsia="en-BE"/>
+          <w:lang/>
         </w:rPr>
       </w:pPr>
       <w:r>
         <w:rPr>
           <w:b/>
           <w:bCs/>
-          <w:lang w:val="en-BE" w:eastAsia="en-BE"/>
+          <w:lang/>
         </w:rPr>
         <w:t>Solution</w:t>
       </w:r>
       <w:r>
         <w:rPr>
-          <w:lang w:val="en-BE" w:eastAsia="en-BE"/>
+          <w:lang/>
         </w:rPr>
         <w:t>: Add "</w:t>
       </w:r>
@@ -5015,13 +5015,13 @@
         <w:rPr>
           <w:i/>
           <w:iCs/>
-          <w:lang w:val="en-BE" w:eastAsia="en-BE"/>
+          <w:lang/>
         </w:rPr>
         <w:t>Confirm</w:t>
       </w:r>
       <w:r>
         <w:rPr>
-          <w:lang w:val="en-BE" w:eastAsia="en-BE"/>
+          <w:lang/>
         </w:rPr>
         <w:t>" and "</w:t>
       </w:r>
@@ -5029,13 +5029,13 @@
         <w:rPr>
           <w:i/>
           <w:iCs/>
-          <w:lang w:val="en-BE" w:eastAsia="en-BE"/>
+          <w:lang/>
         </w:rPr>
         <w:t>Deny</w:t>
       </w:r>
       <w:r>
         <w:rPr>
-          <w:lang w:val="en-BE" w:eastAsia="en-BE"/>
+          <w:lang/>
         </w:rPr>
         <w:t>" buttons for users to review their recorded speech.</w:t>
       </w:r>
@@ -5051,7 +5051,7 @@
           <w:rFonts w:ascii="Times New Roman" w:eastAsia="Times New Roman" w:hAnsi="Times New Roman" w:cs="Times New Roman"/>
           <w:color w:val="auto"/>
           <w:kern w:val="0"/>
-          <w:lang w:val="en-BE" w:eastAsia="en-BE"/>
+          <w:lang/>
           <w14:ligatures w14:val="none"/>
         </w:rPr>
       </w:pPr>
@@ -5059,7 +5059,7 @@
         <w:rPr>
           <w:b/>
           <w:bCs/>
-          <w:lang w:val="en-BE" w:eastAsia="en-BE"/>
+          <w:lang/>
         </w:rPr>
         <w:t>Outcome</w:t>
       </w:r>
@@ -5068,14 +5068,14 @@
           <w:rFonts w:ascii="Times New Roman" w:eastAsia="Times New Roman" w:hAnsi="Times New Roman" w:cs="Times New Roman"/>
           <w:color w:val="auto"/>
           <w:kern w:val="0"/>
-          <w:lang w:val="en-BE" w:eastAsia="en-BE"/>
+          <w:lang/>
           <w14:ligatures w14:val="none"/>
         </w:rPr>
         <w:t xml:space="preserve">: </w:t>
       </w:r>
       <w:r>
         <w:rPr>
-          <w:lang w:val="en-BE" w:eastAsia="en-BE"/>
+          <w:lang/>
         </w:rPr>
         <w:t>Users can ensure their prompt is correct before generating an image, reducing errors.</w:t>
       </w:r>
@@ -5083,12 +5083,12 @@
     <w:p>
       <w:pPr>
         <w:rPr>
-          <w:lang w:val="en-BE"/>
-        </w:rPr>
-      </w:pPr>
-      <w:r>
-        <w:rPr>
-          <w:lang w:val="en-BE"/>
+          <w:lang/>
+        </w:rPr>
+      </w:pPr>
+      <w:r>
+        <w:rPr>
+          <w:lang/>
         </w:rPr>
         <w:br w:type="page"/>
       </w:r>
@@ -5288,23 +5288,7 @@
           <w:b/>
           <w:bCs/>
         </w:rPr>
-        <w:t>/</w:t>
-      </w:r>
-      <w:proofErr w:type="gramStart"/>
-      <w:r>
-        <w:rPr>
-          <w:b/>
-          <w:bCs/>
-        </w:rPr>
-        <w:t>process</w:t>
-      </w:r>
-      <w:proofErr w:type="gramEnd"/>
-      <w:r>
-        <w:rPr>
-          <w:b/>
-          <w:bCs/>
-        </w:rPr>
-        <w:t>-request</w:t>
+        <w:t>/process-request</w:t>
       </w:r>
       <w:r>
         <w:t>: This endpoint receives the user-selected continent and transcribed voice input from the frontend, returning the request status and a corresponding message. In the absence of voice input, a random environment from the chosen continent is retrieved from the database and displayed in the immersive room.</w:t>
@@ -5322,23 +5306,7 @@
           <w:b/>
           <w:bCs/>
         </w:rPr>
-        <w:t>/</w:t>
-      </w:r>
-      <w:proofErr w:type="gramStart"/>
-      <w:r>
-        <w:rPr>
-          <w:b/>
-          <w:bCs/>
-        </w:rPr>
-        <w:t>generate</w:t>
-      </w:r>
-      <w:proofErr w:type="gramEnd"/>
-      <w:r>
-        <w:rPr>
-          <w:b/>
-          <w:bCs/>
-        </w:rPr>
-        <w:t>_environment</w:t>
+        <w:t>/generate_environment</w:t>
       </w:r>
       <w:r>
         <w:t>: This endpoint establishes a connection to the Elastic Search database, searching for a relevant image based on the voice input and continent. If a matching image is found, its path is sent to the Unity application for display in the immersive room. Otherwise, the AI pipeline functions are utilized to generate a new image, which is then sent to Unity for display.</w:t>
@@ -5567,10 +5535,7 @@
     </w:p>
     <w:p>
       <w:pPr>
-        <w:numPr>
-          <w:ilvl w:val="0"/>
-          <w:numId w:val="23"/>
-        </w:numPr>
+        <w:ind w:left="720"/>
       </w:pPr>
     </w:p>
     <w:p>
@@ -5939,61 +5904,201 @@
         <w:t>Throughout the pipeline, we use various AI models that work together to transform user voice input into a visually stunning and immersive experience. This demonstrates the potential of AI-powered media generation in creating engaging and interactive environments.</w:t>
       </w:r>
     </w:p>
+    <w:p>
+      <w:r>
+        <w:br w:type="page"/>
+      </w:r>
+    </w:p>
+    <w:p>
+      <w:pPr>
+        <w:pStyle w:val="Heading1"/>
+        <w:rPr>
+          <w:lang w:val="en-GB"/>
+        </w:rPr>
+      </w:pPr>
+      <w:bookmarkStart w:id="13" w:name="_Toc188880826"/>
+      <w:r>
+        <w:rPr>
+          <w:lang w:val="en-GB"/>
+        </w:rPr>
+        <w:lastRenderedPageBreak/>
+        <w:t>Unity</w:t>
+      </w:r>
+      <w:bookmarkEnd w:id="13"/>
+      <w:r>
+        <w:rPr>
+          <w:lang w:val="en-GB"/>
+        </w:rPr>
+        <w:t xml:space="preserve"> </w:t>
+      </w:r>
+    </w:p>
+    <w:p>
+      <w:r>
+        <w:t>We use the Unity game engine to display the AI-generated images</w:t>
+      </w:r>
+      <w:r>
+        <w:t>, and</w:t>
+      </w:r>
+      <w:r>
+        <w:t xml:space="preserve"> </w:t>
+      </w:r>
+      <w:r>
+        <w:t>play ambient sounds or music</w:t>
+      </w:r>
+      <w:r>
+        <w:t xml:space="preserve"> in the </w:t>
+      </w:r>
+      <w:r>
+        <w:t>i</w:t>
+      </w:r>
+      <w:r>
+        <w:t xml:space="preserve">mmersive </w:t>
+      </w:r>
+      <w:r>
+        <w:t>r</w:t>
+      </w:r>
+      <w:r>
+        <w:t>oom. The images are sent over the network and then used to update the skybox of the environment. This means that the environment can change in real-time based on the user's input.</w:t>
+      </w:r>
+    </w:p>
     <w:p/>
     <w:p>
-      <w:pPr>
-        <w:pStyle w:val="Heading1"/>
-        <w:rPr>
-          <w:lang w:val="en-GB"/>
-        </w:rPr>
-      </w:pPr>
-      <w:bookmarkStart w:id="13" w:name="_Toc188880826"/>
-      <w:r>
-        <w:rPr>
-          <w:lang w:val="en-GB"/>
-        </w:rPr>
-        <w:t>Unity</w:t>
-      </w:r>
-      <w:bookmarkEnd w:id="13"/>
-      <w:r>
-        <w:rPr>
-          <w:lang w:val="en-GB"/>
-        </w:rPr>
+      <w:r>
+        <w:t xml:space="preserve">The sounds are </w:t>
+      </w:r>
+      <w:r>
+        <w:t>split</w:t>
+      </w:r>
+      <w:r>
+        <w:t xml:space="preserve"> in</w:t>
+      </w:r>
+      <w:r>
+        <w:t>to</w:t>
+      </w:r>
+      <w:r>
+        <w:t xml:space="preserve"> the following categories:</w:t>
+      </w:r>
+    </w:p>
+    <w:p>
+      <w:pPr>
+        <w:numPr>
+          <w:ilvl w:val="0"/>
+          <w:numId w:val="23"/>
+        </w:numPr>
+      </w:pPr>
+      <w:r>
+        <w:t>City: sounds of people, cars and other city ambience</w:t>
+      </w:r>
+    </w:p>
+    <w:p>
+      <w:pPr>
+        <w:numPr>
+          <w:ilvl w:val="0"/>
+          <w:numId w:val="23"/>
+        </w:numPr>
+      </w:pPr>
+      <w:r>
+        <w:t>Nature: sounds of birds, cows</w:t>
+      </w:r>
+      <w:r>
+        <w:t>, insects</w:t>
+      </w:r>
+      <w:r>
+        <w:t xml:space="preserve"> and other wildlife</w:t>
+      </w:r>
+    </w:p>
+    <w:p>
+      <w:pPr>
+        <w:numPr>
+          <w:ilvl w:val="0"/>
+          <w:numId w:val="23"/>
+        </w:numPr>
+      </w:pPr>
+      <w:r>
+        <w:t>Wind: sounds of wind (used for barren landscapes)</w:t>
+      </w:r>
+    </w:p>
+    <w:p>
+      <w:pPr>
+        <w:numPr>
+          <w:ilvl w:val="0"/>
+          <w:numId w:val="23"/>
+        </w:numPr>
+      </w:pPr>
+      <w:r>
+        <w:t xml:space="preserve">Ocean: </w:t>
+      </w:r>
+      <w:r>
+        <w:t>w</w:t>
+      </w:r>
+      <w:r>
+        <w:t>aves crashing, and sounds of seagulls</w:t>
+      </w:r>
+    </w:p>
+    <w:p>
+      <w:pPr>
+        <w:numPr>
+          <w:ilvl w:val="0"/>
+          <w:numId w:val="23"/>
+        </w:numPr>
+      </w:pPr>
+      <w:r>
+        <w:t xml:space="preserve">Underwater: </w:t>
+      </w:r>
+      <w:r>
+        <w:t>s</w:t>
+      </w:r>
+      <w:r>
+        <w:t xml:space="preserve">ounds recorded </w:t>
+      </w:r>
+      <w:r>
+        <w:t>underwater</w:t>
+      </w:r>
+    </w:p>
+    <w:p>
+      <w:pPr>
+        <w:numPr>
+          <w:ilvl w:val="0"/>
+          <w:numId w:val="23"/>
+        </w:numPr>
+      </w:pPr>
+      <w:r>
+        <w:t xml:space="preserve">Ambient: </w:t>
+      </w:r>
+      <w:r>
+        <w:t>a</w:t>
+      </w:r>
+      <w:r>
+        <w:t>mbient music</w:t>
+      </w:r>
+    </w:p>
+    <w:p/>
+    <w:p>
+      <w:r>
+        <w:t xml:space="preserve">The logic to pick an ambient sound is based on the image filename, which has to be preceded by one of these categories (e.g. city-kortrijk.jpg). If an image without a prefix </w:t>
+      </w:r>
+      <w:r>
+        <w:t>containing one of the mentioned categories</w:t>
+      </w:r>
+      <w:r>
+        <w:t xml:space="preserve"> is </w:t>
+      </w:r>
+      <w:r>
+        <w:t>received</w:t>
+      </w:r>
+      <w:r>
+        <w:t>, a sound from the “Ambient” category will be played. All sounds present in the project can be used without attributing the authors, and can be adapted into new works</w:t>
+      </w:r>
+      <w:r>
+        <w:t>.</w:t>
+      </w:r>
+    </w:p>
+    <w:p>
+      <w:r>
         <w:t xml:space="preserve"> </w:t>
       </w:r>
     </w:p>
     <w:p>
-      <w:pPr>
-        <w:spacing w:after="160"/>
-        <w:ind w:left="-5" w:right="403"/>
-      </w:pPr>
-      <w:r>
-        <w:t xml:space="preserve">We use the Unity game engine to display the AI-generated images in the </w:t>
-      </w:r>
-      <w:r>
-        <w:t>i</w:t>
-      </w:r>
-      <w:r>
-        <w:t xml:space="preserve">mmersive </w:t>
-      </w:r>
-      <w:r>
-        <w:t>r</w:t>
-      </w:r>
-      <w:r>
-        <w:t>oom</w:t>
-      </w:r>
-      <w:r>
-        <w:t xml:space="preserve"> by running an executable file</w:t>
-      </w:r>
-      <w:r>
-        <w:t>. The images are sent over the network and then used to update the skybox of the environment. This means that the environment can change in real-time based on the user's input.</w:t>
-      </w:r>
-    </w:p>
-    <w:p>
-      <w:pPr>
-        <w:spacing w:after="160"/>
-        <w:ind w:left="-5" w:right="403"/>
-      </w:pPr>
       <w:r>
         <w:t>To make sure the images are displayed correctly, we use a Unity prefab that was provided by the HITLAB team. This prefab is a template that helps us position and render the images in the right way. By using</w:t>
       </w:r>
@@ -6002,6 +6107,21 @@
       </w:r>
       <w:r>
         <w:t>, we can ensure that the images are aligned properly and look good in the Immersive Room.</w:t>
+      </w:r>
+      <w:r>
+        <w:t xml:space="preserve"> </w:t>
+      </w:r>
+    </w:p>
+    <w:p/>
+    <w:p>
+      <w:r>
+        <w:t xml:space="preserve">While an image is generating, the user can play a minigame where they need to locate and click on small MCT robots </w:t>
+      </w:r>
+      <w:r>
+        <w:t>scattered across</w:t>
+      </w:r>
+      <w:r>
+        <w:t xml:space="preserve"> each screen of the immersive room. There are 3 robots on each wall, and once a user has found them all, they can play the game again (provided the image is still generating). When the new image is generated, the game stops, even if the user hasn’t finished it.</w:t>
       </w:r>
     </w:p>
     <w:p>
@@ -6161,45 +6281,189 @@
           <w:lang w:val="fr-BE"/>
         </w:rPr>
       </w:pPr>
-      <w:proofErr w:type="spellStart"/>
       <w:r>
         <w:rPr>
           <w:b/>
           <w:bCs/>
           <w:lang w:val="fr-BE"/>
         </w:rPr>
-        <w:t>Present</w:t>
-      </w:r>
-      <w:proofErr w:type="spellEnd"/>
+        <w:t>Present :</w:t>
+      </w:r>
       <w:r>
         <w:rPr>
           <w:b/>
           <w:bCs/>
           <w:lang w:val="fr-BE"/>
         </w:rPr>
-        <w:t xml:space="preserve"> :</w:t>
-      </w:r>
-      <w:r>
+        <w:t xml:space="preserve"> </w:t>
+      </w:r>
+    </w:p>
+    <w:p>
+      <w:pPr>
+        <w:rPr>
+          <w:lang w:val="fr-BE"/>
+        </w:rPr>
+      </w:pPr>
+      <w:r>
+        <w:rPr>
+          <w:lang w:val="fr-BE"/>
+        </w:rPr>
+        <w:t>Thibaut De Tandt, Tom De Cavele, Viola Nguyen, Atvars Apinis, Isabelle Deslé</w:t>
+      </w:r>
+    </w:p>
+    <w:p>
+      <w:pPr>
         <w:rPr>
           <w:b/>
           <w:bCs/>
           <w:lang w:val="fr-BE"/>
         </w:rPr>
+      </w:pPr>
+    </w:p>
+    <w:p>
+      <w:pPr>
+        <w:rPr>
+          <w:b/>
+          <w:bCs/>
+        </w:rPr>
+      </w:pPr>
+      <w:r>
+        <w:rPr>
+          <w:b/>
+          <w:bCs/>
+        </w:rPr>
+        <w:t>Results</w:t>
+      </w:r>
+      <w:r>
+        <w:rPr>
+          <w:b/>
+          <w:bCs/>
+        </w:rPr>
         <w:t xml:space="preserve"> </w:t>
       </w:r>
-    </w:p>
-    <w:p>
-      <w:pPr>
-        <w:rPr>
-          <w:lang w:val="fr-BE"/>
-        </w:rPr>
-      </w:pPr>
-      <w:r>
-        <w:rPr>
-          <w:lang w:val="fr-BE"/>
-        </w:rPr>
-        <w:t>Thibaut De Tandt, Tom De Cavele, Viola Nguyen, Atvars Apinis, Isabelle Deslé</w:t>
-      </w:r>
+      <w:r>
+        <w:rPr>
+          <w:b/>
+          <w:bCs/>
+        </w:rPr>
+        <w:t>:</w:t>
+      </w:r>
+      <w:r>
+        <w:rPr>
+          <w:b/>
+          <w:bCs/>
+        </w:rPr>
+        <w:t xml:space="preserve"> </w:t>
+      </w:r>
+    </w:p>
+    <w:p>
+      <w:r>
+        <w:t>1</w:t>
+      </w:r>
+      <w:r>
+        <w:t>.</w:t>
+      </w:r>
+      <w:r>
+        <w:t xml:space="preserve"> </w:t>
+      </w:r>
+      <w:r>
+        <w:t>R</w:t>
+      </w:r>
+      <w:r>
+        <w:t xml:space="preserve">esolution must be </w:t>
+      </w:r>
+      <w:r>
+        <w:t>set to 8k for each Texture2D object in Unity. By default, they are only 2k.</w:t>
+      </w:r>
+    </w:p>
+    <w:p>
+      <w:r>
+        <w:t>2</w:t>
+      </w:r>
+      <w:r>
+        <w:t>.</w:t>
+      </w:r>
+      <w:r>
+        <w:t xml:space="preserve"> Instead of a 5G adapter, the pc will be connected to the internet via an ethernet cable, and the laptop can then send images to it over Wi-Fi.</w:t>
+      </w:r>
+    </w:p>
+    <w:p/>
+    <w:p>
+      <w:pPr>
+        <w:jc w:val="center"/>
+      </w:pPr>
+    </w:p>
+    <w:p>
+      <w:pPr>
+        <w:pStyle w:val="Heading2"/>
+        <w:rPr>
+          <w:lang w:val="en-GB"/>
+        </w:rPr>
+      </w:pPr>
+      <w:bookmarkStart w:id="18" w:name="_Toc188639058"/>
+      <w:bookmarkStart w:id="19" w:name="_Toc188880829"/>
+      <w:r>
+        <w:rPr>
+          <w:lang w:val="en-GB"/>
+        </w:rPr>
+        <w:t>14/01/2025 Immersive room</w:t>
+      </w:r>
+      <w:bookmarkEnd w:id="18"/>
+      <w:r>
+        <w:rPr>
+          <w:lang w:val="en-GB"/>
+        </w:rPr>
+        <w:t>: inpainting, connectivity</w:t>
+      </w:r>
+      <w:bookmarkEnd w:id="19"/>
+    </w:p>
+    <w:p>
+      <w:pPr>
+        <w:rPr>
+          <w:b/>
+          <w:bCs/>
+        </w:rPr>
+      </w:pPr>
+      <w:r>
+        <w:rPr>
+          <w:b/>
+          <w:bCs/>
+        </w:rPr>
+        <w:t xml:space="preserve">Purpose of the test: </w:t>
+      </w:r>
+    </w:p>
+    <w:p>
+      <w:r>
+        <w:t>1</w:t>
+      </w:r>
+      <w:r>
+        <w:t>.</w:t>
+      </w:r>
+      <w:r>
+        <w:t xml:space="preserve"> </w:t>
+      </w:r>
+      <w:r>
+        <w:t>Evaluate the image inpainting.</w:t>
+      </w:r>
+    </w:p>
+    <w:p>
+      <w:r>
+        <w:t>2</w:t>
+      </w:r>
+      <w:r>
+        <w:t>. Test the connection to the Immersive Room PC.</w:t>
+      </w:r>
+      <w:r>
+        <w:t xml:space="preserve"> </w:t>
+      </w:r>
+    </w:p>
+    <w:p>
+      <w:pPr>
+        <w:rPr>
+          <w:b/>
+          <w:bCs/>
+        </w:rPr>
+      </w:pPr>
     </w:p>
     <w:p>
       <w:pPr>
@@ -6209,172 +6473,14 @@
           <w:lang w:val="fr-BE"/>
         </w:rPr>
       </w:pPr>
-    </w:p>
-    <w:p>
-      <w:pPr>
-        <w:rPr>
-          <w:b/>
-          <w:bCs/>
-        </w:rPr>
-      </w:pPr>
-      <w:proofErr w:type="gramStart"/>
-      <w:r>
-        <w:rPr>
-          <w:b/>
-          <w:bCs/>
-        </w:rPr>
-        <w:t>Results</w:t>
-      </w:r>
-      <w:r>
-        <w:rPr>
-          <w:b/>
-          <w:bCs/>
-        </w:rPr>
-        <w:t xml:space="preserve"> </w:t>
-      </w:r>
-      <w:r>
-        <w:rPr>
-          <w:b/>
-          <w:bCs/>
-        </w:rPr>
-        <w:t>:</w:t>
-      </w:r>
-      <w:proofErr w:type="gramEnd"/>
-      <w:r>
-        <w:rPr>
-          <w:b/>
-          <w:bCs/>
-        </w:rPr>
-        <w:t xml:space="preserve"> </w:t>
-      </w:r>
-    </w:p>
-    <w:p>
-      <w:r>
-        <w:t>1</w:t>
-      </w:r>
-      <w:r>
-        <w:t>.</w:t>
-      </w:r>
-      <w:r>
-        <w:t xml:space="preserve"> </w:t>
-      </w:r>
-      <w:r>
-        <w:t>R</w:t>
-      </w:r>
-      <w:r>
-        <w:t xml:space="preserve">esolution must be </w:t>
-      </w:r>
-      <w:r>
-        <w:t>set to 8k for each Texture2D object in Unity. By default, they are only 2k.</w:t>
-      </w:r>
-    </w:p>
-    <w:p>
-      <w:r>
-        <w:t>2</w:t>
-      </w:r>
-      <w:r>
-        <w:t>.</w:t>
-      </w:r>
-      <w:r>
-        <w:t xml:space="preserve"> Instead of a 5G adapter, the pc will be connected to the internet via an ethernet cable, and the laptop can then send images to it over Wi-Fi.</w:t>
-      </w:r>
-    </w:p>
-    <w:p/>
-    <w:p>
-      <w:pPr>
-        <w:jc w:val="center"/>
-      </w:pPr>
-    </w:p>
-    <w:p>
-      <w:pPr>
-        <w:pStyle w:val="Heading2"/>
-        <w:rPr>
-          <w:lang w:val="en-GB"/>
-        </w:rPr>
-      </w:pPr>
-      <w:bookmarkStart w:id="18" w:name="_Toc188639058"/>
-      <w:bookmarkStart w:id="19" w:name="_Toc188880829"/>
-      <w:r>
-        <w:rPr>
-          <w:lang w:val="en-GB"/>
-        </w:rPr>
-        <w:t>14/01/2025 Immersive room</w:t>
-      </w:r>
-      <w:bookmarkEnd w:id="18"/>
-      <w:r>
-        <w:rPr>
-          <w:lang w:val="en-GB"/>
-        </w:rPr>
-        <w:t>: inpainting, connectivity</w:t>
-      </w:r>
-      <w:bookmarkEnd w:id="19"/>
-    </w:p>
-    <w:p>
-      <w:pPr>
-        <w:rPr>
-          <w:b/>
-          <w:bCs/>
-        </w:rPr>
-      </w:pPr>
-      <w:r>
-        <w:rPr>
-          <w:b/>
-          <w:bCs/>
-        </w:rPr>
-        <w:t xml:space="preserve">Purpose of the test: </w:t>
-      </w:r>
-    </w:p>
-    <w:p>
-      <w:r>
-        <w:t>1</w:t>
-      </w:r>
-      <w:r>
-        <w:t>.</w:t>
-      </w:r>
-      <w:r>
-        <w:t xml:space="preserve"> </w:t>
-      </w:r>
-      <w:r>
-        <w:t>Evaluate the image inpainting.</w:t>
-      </w:r>
-    </w:p>
-    <w:p>
-      <w:r>
-        <w:t>2</w:t>
-      </w:r>
-      <w:r>
-        <w:t>. Test the connection to the Immersive Room PC.</w:t>
-      </w:r>
-      <w:r>
-        <w:t xml:space="preserve"> </w:t>
-      </w:r>
-    </w:p>
-    <w:p>
-      <w:pPr>
-        <w:rPr>
-          <w:b/>
-          <w:bCs/>
-        </w:rPr>
-      </w:pPr>
-    </w:p>
-    <w:p>
-      <w:pPr>
+      <w:r>
         <w:rPr>
           <w:b/>
           <w:bCs/>
           <w:lang w:val="fr-BE"/>
         </w:rPr>
-      </w:pPr>
-      <w:proofErr w:type="spellStart"/>
-      <w:r>
-        <w:rPr>
-          <w:b/>
-          <w:bCs/>
-          <w:lang w:val="fr-BE"/>
-        </w:rPr>
         <w:t>Present</w:t>
       </w:r>
-      <w:proofErr w:type="spellEnd"/>
       <w:r>
         <w:rPr>
           <w:b/>
@@ -6542,21 +6648,7 @@
         <w:rPr>
           <w:lang w:val="en-US"/>
         </w:rPr>
-        <w:t xml:space="preserve">9 pictures of the MCT robots will be overlaid on the image. This will engage the users while they </w:t>
-      </w:r>
-      <w:proofErr w:type="gramStart"/>
-      <w:r>
-        <w:rPr>
-          <w:lang w:val="en-US"/>
-        </w:rPr>
-        <w:t>have to</w:t>
-      </w:r>
-      <w:proofErr w:type="gramEnd"/>
-      <w:r>
-        <w:rPr>
-          <w:lang w:val="en-US"/>
-        </w:rPr>
-        <w:t xml:space="preserve"> wait for the new picture to generate.</w:t>
+        <w:t>9 pictures of the MCT robots will be overlaid on the image. This will engage the users while they have to wait for the new picture to generate.</w:t>
       </w:r>
     </w:p>
     <w:p>
@@ -6580,7 +6672,6 @@
           <w:numId w:val="29"/>
         </w:numPr>
       </w:pPr>
-      <w:proofErr w:type="gramStart"/>
       <w:r>
         <w:rPr>
           <w:lang w:val="en-US"/>
@@ -6592,7 +6683,6 @@
         <w:t>ebservice</w:t>
       </w:r>
       <w:proofErr w:type="spellEnd"/>
-      <w:proofErr w:type="gramEnd"/>
       <w:r>
         <w:t xml:space="preserve"> is accessible via </w:t>
       </w:r>
@@ -6621,7 +6711,6 @@
           <w:lang w:val="fr-BE"/>
         </w:rPr>
       </w:pPr>
-      <w:proofErr w:type="spellStart"/>
       <w:r>
         <w:rPr>
           <w:b/>
@@ -6630,7 +6719,6 @@
         </w:rPr>
         <w:t>Present</w:t>
       </w:r>
-      <w:proofErr w:type="spellEnd"/>
       <w:r>
         <w:rPr>
           <w:b/>
@@ -6799,16 +6887,11 @@
       <w:r>
         <w:t xml:space="preserve">ind </w:t>
       </w:r>
-      <w:proofErr w:type="gramStart"/>
       <w:r>
         <w:t>T</w:t>
       </w:r>
       <w:r>
-        <w:t>he</w:t>
-      </w:r>
-      <w:proofErr w:type="gramEnd"/>
-      <w:r>
-        <w:t xml:space="preserve"> </w:t>
+        <w:t xml:space="preserve">he </w:t>
       </w:r>
       <w:r>
         <w:t>R</w:t>
@@ -6832,7 +6915,6 @@
           <w:lang w:val="fr-BE"/>
         </w:rPr>
       </w:pPr>
-      <w:proofErr w:type="spellStart"/>
       <w:r>
         <w:rPr>
           <w:b/>
@@ -6841,7 +6923,6 @@
         </w:rPr>
         <w:t>Present</w:t>
       </w:r>
-      <w:proofErr w:type="spellEnd"/>
       <w:r>
         <w:rPr>
           <w:b/>
@@ -6924,15 +7005,7 @@
         </w:numPr>
       </w:pPr>
       <w:r>
-        <w:t xml:space="preserve">Ambient sounds </w:t>
-      </w:r>
-      <w:proofErr w:type="gramStart"/>
-      <w:r>
-        <w:t>play, and</w:t>
-      </w:r>
-      <w:proofErr w:type="gramEnd"/>
-      <w:r>
-        <w:t xml:space="preserve"> are associated with the image (if the image is not generated on the spot).</w:t>
+        <w:t>Ambient sounds play, and are associated with the image (if the image is not generated on the spot).</w:t>
       </w:r>
     </w:p>
     <w:p>
@@ -6954,23 +7027,7 @@
         </w:numPr>
       </w:pPr>
       <w:r>
-        <w:t xml:space="preserve">Research if </w:t>
-      </w:r>
-      <w:proofErr w:type="gramStart"/>
-      <w:r>
-        <w:t>possible</w:t>
-      </w:r>
-      <w:proofErr w:type="gramEnd"/>
-      <w:r>
-        <w:t xml:space="preserve"> to add automatically an appropriate category for new generated images. (</w:t>
-      </w:r>
-      <w:proofErr w:type="gramStart"/>
-      <w:r>
-        <w:t>so</w:t>
-      </w:r>
-      <w:proofErr w:type="gramEnd"/>
-      <w:r>
-        <w:t xml:space="preserve"> the images that are generated in real-time have appropriate background music)</w:t>
+        <w:t>Research if possible to add automatically an appropriate category for new generated images. (so the images that are generated in real-time have appropriate background music)</w:t>
       </w:r>
     </w:p>
     <w:p>
@@ -7058,8 +7115,6 @@
           <w:lang w:val="fr-BE"/>
         </w:rPr>
       </w:pPr>
-      <w:proofErr w:type="spellStart"/>
-      <w:proofErr w:type="gramStart"/>
       <w:r>
         <w:rPr>
           <w:b/>
@@ -7068,19 +7123,11 @@
         </w:rPr>
         <w:t>Present</w:t>
       </w:r>
-      <w:proofErr w:type="spellEnd"/>
       <w:r>
         <w:rPr>
           <w:lang w:val="fr-BE"/>
         </w:rPr>
-        <w:t>:</w:t>
-      </w:r>
-      <w:proofErr w:type="gramEnd"/>
-      <w:r>
-        <w:rPr>
-          <w:lang w:val="fr-BE"/>
-        </w:rPr>
-        <w:t xml:space="preserve"> </w:t>
+        <w:t xml:space="preserve">: </w:t>
       </w:r>
     </w:p>
     <w:p>
@@ -7514,7 +7561,19 @@
         <w:ind w:left="360"/>
       </w:pPr>
       <w:r>
-        <w:t>It is unnecessary and potentially dangerous to make changes to the functionality of the project, so we should focus all our efforts on the documentation instead.</w:t>
+        <w:t xml:space="preserve">It is unnecessary </w:t>
+      </w:r>
+      <w:r>
+        <w:t xml:space="preserve">and potentially harmful </w:t>
+      </w:r>
+      <w:r>
+        <w:t>to make changes to the functionality of the project</w:t>
+      </w:r>
+      <w:r>
+        <w:t xml:space="preserve"> now</w:t>
+      </w:r>
+      <w:r>
+        <w:t>, so we should focus all our efforts on the documentation instead.</w:t>
       </w:r>
     </w:p>
     <w:p/>
@@ -15211,10 +15270,6 @@
 </file>
 
 <file path=customXml/item1.xml><?xml version="1.0" encoding="utf-8"?>
-<b:Sources xmlns:b="http://schemas.openxmlformats.org/officeDocument/2006/bibliography" xmlns="http://schemas.openxmlformats.org/officeDocument/2006/bibliography" SelectedStyle="\APASixthEditionOfficeOnline.xsl" StyleName="APA" Version="6"/>
-</file>
-
-<file path=customXml/item2.xml><?xml version="1.0" encoding="utf-8"?>
 <ct:contentTypeSchema xmlns:ct="http://schemas.microsoft.com/office/2006/metadata/contentType" xmlns:ma="http://schemas.microsoft.com/office/2006/metadata/properties/metaAttributes" ct:_="" ma:_="" ma:contentTypeName="Document" ma:contentTypeID="0x01010018DC116B99092D4D8A5F6B343143F90C" ma:contentTypeVersion="11" ma:contentTypeDescription="Een nieuw document maken." ma:contentTypeScope="" ma:versionID="11babd701b95b9de7e78c95a8b5dfaf8">
   <xsd:schema xmlns:xsd="http://www.w3.org/2001/XMLSchema" xmlns:xs="http://www.w3.org/2001/XMLSchema" xmlns:p="http://schemas.microsoft.com/office/2006/metadata/properties" xmlns:ns3="23a67101-b336-418c-b344-15be425e7264" targetNamespace="http://schemas.microsoft.com/office/2006/metadata/properties" ma:root="true" ma:fieldsID="8257eb286c57542a8453cd2a6b9bc064" ns3:_="">
     <xsd:import namespace="23a67101-b336-418c-b344-15be425e7264"/>
@@ -15402,7 +15457,19 @@
 </ct:contentTypeSchema>
 </file>
 
+<file path=customXml/item2.xml><?xml version="1.0" encoding="utf-8"?>
+<b:Sources xmlns:b="http://schemas.openxmlformats.org/officeDocument/2006/bibliography" xmlns="http://schemas.openxmlformats.org/officeDocument/2006/bibliography" SelectedStyle="\APASixthEditionOfficeOnline.xsl" StyleName="APA" Version="6"/>
+</file>
+
 <file path=customXml/item3.xml><?xml version="1.0" encoding="utf-8"?>
+<p:properties xmlns:p="http://schemas.microsoft.com/office/2006/metadata/properties" xmlns:xsi="http://www.w3.org/2001/XMLSchema-instance" xmlns:pc="http://schemas.microsoft.com/office/infopath/2007/PartnerControls">
+  <documentManagement>
+    <_activity xmlns="23a67101-b336-418c-b344-15be425e7264" xsi:nil="true"/>
+  </documentManagement>
+</p:properties>
+</file>
+
+<file path=customXml/item4.xml><?xml version="1.0" encoding="utf-8"?>
 <?mso-contentType ?>
 <FormTemplates xmlns="http://schemas.microsoft.com/sharepoint/v3/contenttype/forms">
   <Display>DocumentLibraryForm</Display>
@@ -15411,23 +15478,7 @@
 </FormTemplates>
 </file>
 
-<file path=customXml/item4.xml><?xml version="1.0" encoding="utf-8"?>
-<p:properties xmlns:p="http://schemas.microsoft.com/office/2006/metadata/properties" xmlns:xsi="http://www.w3.org/2001/XMLSchema-instance" xmlns:pc="http://schemas.microsoft.com/office/infopath/2007/PartnerControls">
-  <documentManagement>
-    <_activity xmlns="23a67101-b336-418c-b344-15be425e7264" xsi:nil="true"/>
-  </documentManagement>
-</p:properties>
-</file>
-
 <file path=customXml/itemProps1.xml><?xml version="1.0" encoding="utf-8"?>
-<ds:datastoreItem xmlns:ds="http://schemas.openxmlformats.org/officeDocument/2006/customXml" ds:itemID="{950EFBE2-D04B-487D-ACE8-95A0899E4AE5}">
-  <ds:schemaRefs>
-    <ds:schemaRef ds:uri="http://schemas.openxmlformats.org/officeDocument/2006/bibliography"/>
-  </ds:schemaRefs>
-</ds:datastoreItem>
-</file>
-
-<file path=customXml/itemProps2.xml><?xml version="1.0" encoding="utf-8"?>
 <ds:datastoreItem xmlns:ds="http://schemas.openxmlformats.org/officeDocument/2006/customXml" ds:itemID="{1F906CB3-1E4D-49FB-B35E-58CDAE94727B}">
   <ds:schemaRefs>
     <ds:schemaRef ds:uri="http://schemas.microsoft.com/office/2006/metadata/contentType"/>
@@ -15445,15 +15496,15 @@
 </ds:datastoreItem>
 </file>
 
-<file path=customXml/itemProps3.xml><?xml version="1.0" encoding="utf-8"?>
-<ds:datastoreItem xmlns:ds="http://schemas.openxmlformats.org/officeDocument/2006/customXml" ds:itemID="{AC539E09-CDEA-4A8A-A36A-26E96334EAC3}">
+<file path=customXml/itemProps2.xml><?xml version="1.0" encoding="utf-8"?>
+<ds:datastoreItem xmlns:ds="http://schemas.openxmlformats.org/officeDocument/2006/customXml" ds:itemID="{950EFBE2-D04B-487D-ACE8-95A0899E4AE5}">
   <ds:schemaRefs>
-    <ds:schemaRef ds:uri="http://schemas.microsoft.com/sharepoint/v3/contenttype/forms"/>
+    <ds:schemaRef ds:uri="http://schemas.openxmlformats.org/officeDocument/2006/bibliography"/>
   </ds:schemaRefs>
 </ds:datastoreItem>
 </file>
 
-<file path=customXml/itemProps4.xml><?xml version="1.0" encoding="utf-8"?>
+<file path=customXml/itemProps3.xml><?xml version="1.0" encoding="utf-8"?>
 <ds:datastoreItem xmlns:ds="http://schemas.openxmlformats.org/officeDocument/2006/customXml" ds:itemID="{65AE7EF0-0F62-4347-BDA6-727625CEADD1}">
   <ds:schemaRefs>
     <ds:schemaRef ds:uri="http://schemas.microsoft.com/office/2006/metadata/properties"/>
@@ -15461,4 +15512,12 @@
     <ds:schemaRef ds:uri="23a67101-b336-418c-b344-15be425e7264"/>
   </ds:schemaRefs>
 </ds:datastoreItem>
+</file>
+
+<file path=customXml/itemProps4.xml><?xml version="1.0" encoding="utf-8"?>
+<ds:datastoreItem xmlns:ds="http://schemas.openxmlformats.org/officeDocument/2006/customXml" ds:itemID="{AC539E09-CDEA-4A8A-A36A-26E96334EAC3}">
+  <ds:schemaRefs>
+    <ds:schemaRef ds:uri="http://schemas.microsoft.com/sharepoint/v3/contenttype/forms"/>
+  </ds:schemaRefs>
+</ds:datastoreItem>
 </file>
</xml_diff>

<commit_message>
made thhe unity part more clear
</commit_message>
<xml_diff>
--- a/Presentation/FunctionalAnalysisFinal.docx
+++ b/Presentation/FunctionalAnalysisFinal.docx
@@ -475,7 +475,6 @@
               <w:rFonts w:asciiTheme="minorHAnsi" w:eastAsiaTheme="minorEastAsia" w:hAnsiTheme="minorHAnsi" w:cstheme="minorBidi"/>
               <w:noProof/>
               <w:color w:val="auto"/>
-              <w:lang/>
             </w:rPr>
           </w:pPr>
           <w:r>
@@ -565,7 +564,6 @@
               <w:rFonts w:asciiTheme="minorHAnsi" w:eastAsiaTheme="minorEastAsia" w:hAnsiTheme="minorHAnsi" w:cstheme="minorBidi"/>
               <w:noProof/>
               <w:color w:val="auto"/>
-              <w:lang/>
             </w:rPr>
           </w:pPr>
           <w:hyperlink w:anchor="_Toc188880814" w:history="1">
@@ -637,7 +635,6 @@
               <w:rFonts w:asciiTheme="minorHAnsi" w:eastAsiaTheme="minorEastAsia" w:hAnsiTheme="minorHAnsi" w:cstheme="minorBidi"/>
               <w:noProof/>
               <w:color w:val="auto"/>
-              <w:lang/>
             </w:rPr>
           </w:pPr>
           <w:hyperlink w:anchor="_Toc188880815" w:history="1">
@@ -709,7 +706,6 @@
               <w:rFonts w:asciiTheme="minorHAnsi" w:eastAsiaTheme="minorEastAsia" w:hAnsiTheme="minorHAnsi" w:cstheme="minorBidi"/>
               <w:noProof/>
               <w:color w:val="auto"/>
-              <w:lang/>
             </w:rPr>
           </w:pPr>
           <w:hyperlink w:anchor="_Toc188880816" w:history="1">
@@ -781,7 +777,6 @@
               <w:rFonts w:asciiTheme="minorHAnsi" w:eastAsiaTheme="minorEastAsia" w:hAnsiTheme="minorHAnsi" w:cstheme="minorBidi"/>
               <w:noProof/>
               <w:color w:val="auto"/>
-              <w:lang/>
             </w:rPr>
           </w:pPr>
           <w:hyperlink w:anchor="_Toc188880817" w:history="1">
@@ -853,7 +848,6 @@
               <w:rFonts w:asciiTheme="minorHAnsi" w:eastAsiaTheme="minorEastAsia" w:hAnsiTheme="minorHAnsi" w:cstheme="minorBidi"/>
               <w:noProof/>
               <w:color w:val="auto"/>
-              <w:lang/>
             </w:rPr>
           </w:pPr>
           <w:hyperlink w:anchor="_Toc188880818" w:history="1">
@@ -925,7 +919,6 @@
               <w:rFonts w:asciiTheme="minorHAnsi" w:eastAsiaTheme="minorEastAsia" w:hAnsiTheme="minorHAnsi" w:cstheme="minorBidi"/>
               <w:noProof/>
               <w:color w:val="auto"/>
-              <w:lang/>
             </w:rPr>
           </w:pPr>
           <w:hyperlink w:anchor="_Toc188880819" w:history="1">
@@ -997,7 +990,6 @@
               <w:rFonts w:asciiTheme="minorHAnsi" w:eastAsiaTheme="minorEastAsia" w:hAnsiTheme="minorHAnsi" w:cstheme="minorBidi"/>
               <w:noProof/>
               <w:color w:val="auto"/>
-              <w:lang/>
             </w:rPr>
           </w:pPr>
           <w:hyperlink w:anchor="_Toc188880820" w:history="1">
@@ -1069,7 +1061,6 @@
               <w:rFonts w:asciiTheme="minorHAnsi" w:eastAsiaTheme="minorEastAsia" w:hAnsiTheme="minorHAnsi" w:cstheme="minorBidi"/>
               <w:noProof/>
               <w:color w:val="auto"/>
-              <w:lang/>
             </w:rPr>
           </w:pPr>
           <w:hyperlink w:anchor="_Toc188880821" w:history="1">
@@ -1141,7 +1132,6 @@
               <w:rFonts w:asciiTheme="minorHAnsi" w:eastAsiaTheme="minorEastAsia" w:hAnsiTheme="minorHAnsi" w:cstheme="minorBidi"/>
               <w:noProof/>
               <w:color w:val="auto"/>
-              <w:lang/>
             </w:rPr>
           </w:pPr>
           <w:hyperlink w:anchor="_Toc188880822" w:history="1">
@@ -1213,7 +1203,6 @@
               <w:rFonts w:asciiTheme="minorHAnsi" w:eastAsiaTheme="minorEastAsia" w:hAnsiTheme="minorHAnsi" w:cstheme="minorBidi"/>
               <w:noProof/>
               <w:color w:val="auto"/>
-              <w:lang/>
             </w:rPr>
           </w:pPr>
           <w:hyperlink w:anchor="_Toc188880823" w:history="1">
@@ -1285,7 +1274,6 @@
               <w:rFonts w:asciiTheme="minorHAnsi" w:eastAsiaTheme="minorEastAsia" w:hAnsiTheme="minorHAnsi" w:cstheme="minorBidi"/>
               <w:noProof/>
               <w:color w:val="auto"/>
-              <w:lang/>
             </w:rPr>
           </w:pPr>
           <w:hyperlink w:anchor="_Toc188880824" w:history="1">
@@ -1357,7 +1345,6 @@
               <w:rFonts w:asciiTheme="minorHAnsi" w:eastAsiaTheme="minorEastAsia" w:hAnsiTheme="minorHAnsi" w:cstheme="minorBidi"/>
               <w:noProof/>
               <w:color w:val="auto"/>
-              <w:lang/>
             </w:rPr>
           </w:pPr>
           <w:hyperlink w:anchor="_Toc188880825" w:history="1">
@@ -1429,7 +1416,6 @@
               <w:rFonts w:asciiTheme="minorHAnsi" w:eastAsiaTheme="minorEastAsia" w:hAnsiTheme="minorHAnsi" w:cstheme="minorBidi"/>
               <w:noProof/>
               <w:color w:val="auto"/>
-              <w:lang/>
             </w:rPr>
           </w:pPr>
           <w:hyperlink w:anchor="_Toc188880826" w:history="1">
@@ -1501,7 +1487,6 @@
               <w:rFonts w:asciiTheme="minorHAnsi" w:eastAsiaTheme="minorEastAsia" w:hAnsiTheme="minorHAnsi" w:cstheme="minorBidi"/>
               <w:noProof/>
               <w:color w:val="auto"/>
-              <w:lang/>
             </w:rPr>
           </w:pPr>
           <w:hyperlink w:anchor="_Toc188880827" w:history="1">
@@ -1573,7 +1558,6 @@
               <w:rFonts w:asciiTheme="minorHAnsi" w:eastAsiaTheme="minorEastAsia" w:hAnsiTheme="minorHAnsi" w:cstheme="minorBidi"/>
               <w:noProof/>
               <w:color w:val="auto"/>
-              <w:lang/>
             </w:rPr>
           </w:pPr>
           <w:hyperlink w:anchor="_Toc188880828" w:history="1">
@@ -1645,7 +1629,6 @@
               <w:rFonts w:asciiTheme="minorHAnsi" w:eastAsiaTheme="minorEastAsia" w:hAnsiTheme="minorHAnsi" w:cstheme="minorBidi"/>
               <w:noProof/>
               <w:color w:val="auto"/>
-              <w:lang/>
             </w:rPr>
           </w:pPr>
           <w:hyperlink w:anchor="_Toc188880829" w:history="1">
@@ -1717,7 +1700,6 @@
               <w:rFonts w:asciiTheme="minorHAnsi" w:eastAsiaTheme="minorEastAsia" w:hAnsiTheme="minorHAnsi" w:cstheme="minorBidi"/>
               <w:noProof/>
               <w:color w:val="auto"/>
-              <w:lang/>
             </w:rPr>
           </w:pPr>
           <w:hyperlink w:anchor="_Toc188880830" w:history="1">
@@ -1789,7 +1771,6 @@
               <w:rFonts w:asciiTheme="minorHAnsi" w:eastAsiaTheme="minorEastAsia" w:hAnsiTheme="minorHAnsi" w:cstheme="minorBidi"/>
               <w:noProof/>
               <w:color w:val="auto"/>
-              <w:lang/>
             </w:rPr>
           </w:pPr>
           <w:hyperlink w:anchor="_Toc188880831" w:history="1">
@@ -1861,7 +1842,6 @@
               <w:rFonts w:asciiTheme="minorHAnsi" w:eastAsiaTheme="minorEastAsia" w:hAnsiTheme="minorHAnsi" w:cstheme="minorBidi"/>
               <w:noProof/>
               <w:color w:val="auto"/>
-              <w:lang/>
             </w:rPr>
           </w:pPr>
           <w:hyperlink w:anchor="_Toc188880832" w:history="1">
@@ -1933,7 +1913,6 @@
               <w:rFonts w:asciiTheme="minorHAnsi" w:eastAsiaTheme="minorEastAsia" w:hAnsiTheme="minorHAnsi" w:cstheme="minorBidi"/>
               <w:noProof/>
               <w:color w:val="auto"/>
-              <w:lang/>
             </w:rPr>
           </w:pPr>
           <w:hyperlink w:anchor="_Toc188880833" w:history="1">
@@ -2005,7 +1984,6 @@
               <w:rFonts w:asciiTheme="minorHAnsi" w:eastAsiaTheme="minorEastAsia" w:hAnsiTheme="minorHAnsi" w:cstheme="minorBidi"/>
               <w:noProof/>
               <w:color w:val="auto"/>
-              <w:lang/>
             </w:rPr>
           </w:pPr>
           <w:hyperlink w:anchor="_Toc188880834" w:history="1">
@@ -2077,7 +2055,6 @@
               <w:rFonts w:asciiTheme="minorHAnsi" w:eastAsiaTheme="minorEastAsia" w:hAnsiTheme="minorHAnsi" w:cstheme="minorBidi"/>
               <w:noProof/>
               <w:color w:val="auto"/>
-              <w:lang/>
             </w:rPr>
           </w:pPr>
           <w:hyperlink w:anchor="_Toc188880835" w:history="1">
@@ -2149,7 +2126,6 @@
               <w:rFonts w:asciiTheme="minorHAnsi" w:eastAsiaTheme="minorEastAsia" w:hAnsiTheme="minorHAnsi" w:cstheme="minorBidi"/>
               <w:noProof/>
               <w:color w:val="auto"/>
-              <w:lang/>
             </w:rPr>
           </w:pPr>
           <w:hyperlink w:anchor="_Toc188880836" w:history="1">
@@ -3936,22 +3912,15 @@
           <w:ilvl w:val="0"/>
           <w:numId w:val="36"/>
         </w:numPr>
-        <w:rPr>
-          <w:lang/>
-        </w:rPr>
       </w:pPr>
       <w:r>
         <w:rPr>
           <w:b/>
           <w:bCs/>
-          <w:lang/>
         </w:rPr>
         <w:t>Continent Selection &amp; Voice Input</w:t>
       </w:r>
       <w:r>
-        <w:rPr>
-          <w:lang/>
-        </w:rPr>
         <w:t>:</w:t>
       </w:r>
     </w:p>
@@ -3964,14 +3933,8 @@
         <w:tabs>
           <w:tab w:val="num" w:pos="720"/>
         </w:tabs>
-        <w:rPr>
-          <w:lang/>
-        </w:rPr>
-      </w:pPr>
-      <w:r>
-        <w:rPr>
-          <w:lang/>
-        </w:rPr>
+      </w:pPr>
+      <w:r>
         <w:t>Users can select a continent via a navigation screen.</w:t>
       </w:r>
     </w:p>
@@ -3984,14 +3947,8 @@
         <w:tabs>
           <w:tab w:val="num" w:pos="720"/>
         </w:tabs>
-        <w:rPr>
-          <w:lang/>
-        </w:rPr>
-      </w:pPr>
-      <w:r>
-        <w:rPr>
-          <w:lang/>
-        </w:rPr>
+      </w:pPr>
+      <w:r>
         <w:t>An optional voice input feature enhances the immersive experience.</w:t>
       </w:r>
     </w:p>
@@ -4002,22 +3959,15 @@
           <w:ilvl w:val="0"/>
           <w:numId w:val="36"/>
         </w:numPr>
-        <w:rPr>
-          <w:lang/>
-        </w:rPr>
       </w:pPr>
       <w:r>
         <w:rPr>
           <w:b/>
           <w:bCs/>
-          <w:lang/>
         </w:rPr>
         <w:t>Immersive Visuals</w:t>
       </w:r>
       <w:r>
-        <w:rPr>
-          <w:lang/>
-        </w:rPr>
         <w:t>:</w:t>
       </w:r>
     </w:p>
@@ -4027,14 +3977,8 @@
           <w:ilvl w:val="0"/>
           <w:numId w:val="37"/>
         </w:numPr>
-        <w:rPr>
-          <w:lang/>
-        </w:rPr>
-      </w:pPr>
-      <w:r>
-        <w:rPr>
-          <w:lang/>
-        </w:rPr>
+      </w:pPr>
+      <w:r>
         <w:t>Images are displayed seamlessly across all four walls of the immersive room.</w:t>
       </w:r>
     </w:p>
@@ -4044,14 +3988,8 @@
           <w:ilvl w:val="0"/>
           <w:numId w:val="37"/>
         </w:numPr>
-        <w:rPr>
-          <w:lang/>
-        </w:rPr>
-      </w:pPr>
-      <w:r>
-        <w:rPr>
-          <w:lang/>
-        </w:rPr>
+      </w:pPr>
+      <w:r>
         <w:t>Images must be high resolution, appropriately scaled, and accurately sized.</w:t>
       </w:r>
     </w:p>
@@ -4062,22 +4000,15 @@
           <w:ilvl w:val="0"/>
           <w:numId w:val="36"/>
         </w:numPr>
-        <w:rPr>
-          <w:lang/>
-        </w:rPr>
       </w:pPr>
       <w:r>
         <w:rPr>
           <w:b/>
           <w:bCs/>
-          <w:lang/>
         </w:rPr>
         <w:t>Audio Experience</w:t>
       </w:r>
       <w:r>
-        <w:rPr>
-          <w:lang/>
-        </w:rPr>
         <w:t>:</w:t>
       </w:r>
     </w:p>
@@ -4087,14 +4018,8 @@
           <w:ilvl w:val="0"/>
           <w:numId w:val="34"/>
         </w:numPr>
-        <w:rPr>
-          <w:lang/>
-        </w:rPr>
-      </w:pPr>
-      <w:r>
-        <w:rPr>
-          <w:lang/>
-        </w:rPr>
+      </w:pPr>
+      <w:r>
         <w:t>Relevant sounds or music must accompany the images to heighten immersion.</w:t>
       </w:r>
     </w:p>
@@ -4105,22 +4030,15 @@
           <w:ilvl w:val="0"/>
           <w:numId w:val="36"/>
         </w:numPr>
-        <w:rPr>
-          <w:lang/>
-        </w:rPr>
       </w:pPr>
       <w:r>
         <w:rPr>
           <w:b/>
           <w:bCs/>
-          <w:lang/>
         </w:rPr>
         <w:t>AI-Generated Images</w:t>
       </w:r>
       <w:r>
-        <w:rPr>
-          <w:lang/>
-        </w:rPr>
         <w:t>:</w:t>
       </w:r>
     </w:p>
@@ -4130,14 +4048,8 @@
           <w:ilvl w:val="0"/>
           <w:numId w:val="35"/>
         </w:numPr>
-        <w:rPr>
-          <w:lang/>
-        </w:rPr>
-      </w:pPr>
-      <w:r>
-        <w:rPr>
-          <w:lang/>
-        </w:rPr>
+      </w:pPr>
+      <w:r>
         <w:t>All images must be AI-generated.</w:t>
       </w:r>
     </w:p>
@@ -4147,14 +4059,8 @@
           <w:ilvl w:val="0"/>
           <w:numId w:val="35"/>
         </w:numPr>
-        <w:rPr>
-          <w:lang/>
-        </w:rPr>
-      </w:pPr>
-      <w:r>
-        <w:rPr>
-          <w:lang/>
-        </w:rPr>
+      </w:pPr>
+      <w:r>
         <w:t>Pregenerated images should match the selected continent and voice input.</w:t>
       </w:r>
     </w:p>
@@ -4164,14 +4070,8 @@
           <w:ilvl w:val="0"/>
           <w:numId w:val="35"/>
         </w:numPr>
-        <w:rPr>
-          <w:lang/>
-        </w:rPr>
-      </w:pPr>
-      <w:r>
-        <w:rPr>
-          <w:lang/>
-        </w:rPr>
+      </w:pPr>
+      <w:r>
         <w:t>On-the-spot image generation must occur within an acceptable timeframe.</w:t>
       </w:r>
     </w:p>
@@ -4181,36 +4081,18 @@
           <w:ilvl w:val="0"/>
           <w:numId w:val="35"/>
         </w:numPr>
-        <w:rPr>
-          <w:lang/>
-        </w:rPr>
-      </w:pPr>
-      <w:r>
-        <w:rPr>
-          <w:lang/>
-        </w:rPr>
+      </w:pPr>
+      <w:r>
         <w:t xml:space="preserve">The AI model used for image generation must be free </w:t>
       </w:r>
       <w:r>
-        <w:rPr>
-          <w:lang/>
-        </w:rPr>
         <w:t>for non-commercial use</w:t>
       </w:r>
       <w:r>
-        <w:rPr>
-          <w:lang/>
-        </w:rPr>
         <w:t>.</w:t>
       </w:r>
     </w:p>
-    <w:p>
-      <w:pPr>
-        <w:rPr>
-          <w:lang/>
-        </w:rPr>
-      </w:pPr>
-    </w:p>
+    <w:p/>
     <w:p>
       <w:pPr>
         <w:pStyle w:val="Heading2"/>
@@ -4264,22 +4146,15 @@
           <w:ilvl w:val="0"/>
           <w:numId w:val="41"/>
         </w:numPr>
-        <w:rPr>
-          <w:lang/>
-        </w:rPr>
       </w:pPr>
       <w:r>
         <w:rPr>
           <w:b/>
           <w:bCs/>
-          <w:lang/>
         </w:rPr>
         <w:t>Alternative Interface</w:t>
       </w:r>
       <w:r>
-        <w:rPr>
-          <w:lang/>
-        </w:rPr>
         <w:t>:</w:t>
       </w:r>
     </w:p>
@@ -4292,14 +4167,8 @@
         <w:tabs>
           <w:tab w:val="num" w:pos="720"/>
         </w:tabs>
-        <w:rPr>
-          <w:lang/>
-        </w:rPr>
-      </w:pPr>
-      <w:r>
-        <w:rPr>
-          <w:lang/>
-        </w:rPr>
+      </w:pPr>
+      <w:r>
         <w:t>Allow users to interact with the system via a tablet or phone instead of a keyboard.</w:t>
       </w:r>
     </w:p>
@@ -4310,22 +4179,15 @@
           <w:ilvl w:val="0"/>
           <w:numId w:val="41"/>
         </w:numPr>
-        <w:rPr>
-          <w:lang/>
-        </w:rPr>
       </w:pPr>
       <w:r>
         <w:rPr>
           <w:b/>
           <w:bCs/>
-          <w:lang/>
         </w:rPr>
         <w:t>Advanced Image Search</w:t>
       </w:r>
       <w:r>
-        <w:rPr>
-          <w:lang/>
-        </w:rPr>
         <w:t>:</w:t>
       </w:r>
     </w:p>
@@ -4338,14 +4200,8 @@
         <w:tabs>
           <w:tab w:val="num" w:pos="720"/>
         </w:tabs>
-        <w:rPr>
-          <w:lang/>
-        </w:rPr>
-      </w:pPr>
-      <w:r>
-        <w:rPr>
-          <w:lang/>
-        </w:rPr>
+      </w:pPr>
+      <w:r>
         <w:t>Provide full-text search with fuzziness to locate pregenerated images that approximate the voice input.</w:t>
       </w:r>
     </w:p>
@@ -4356,28 +4212,18 @@
           <w:ilvl w:val="0"/>
           <w:numId w:val="41"/>
         </w:numPr>
-        <w:rPr>
-          <w:lang/>
-        </w:rPr>
-      </w:pPr>
-      <w:r>
-        <w:rPr>
-          <w:lang/>
-        </w:rPr>
+      </w:pPr>
+      <w:r>
         <w:t xml:space="preserve"> </w:t>
       </w:r>
       <w:r>
         <w:rPr>
           <w:b/>
           <w:bCs/>
-          <w:lang/>
         </w:rPr>
         <w:t>AI-Generated Audio</w:t>
       </w:r>
       <w:r>
-        <w:rPr>
-          <w:lang/>
-        </w:rPr>
         <w:t>:</w:t>
       </w:r>
     </w:p>
@@ -4387,24 +4233,12 @@
           <w:ilvl w:val="0"/>
           <w:numId w:val="40"/>
         </w:numPr>
-        <w:rPr>
-          <w:lang/>
-        </w:rPr>
-      </w:pPr>
-      <w:r>
-        <w:rPr>
-          <w:lang/>
-        </w:rPr>
+      </w:pPr>
+      <w:r>
         <w:t>Leverage AI to create custom music or ambient sounds for enhanced user engagement.</w:t>
       </w:r>
     </w:p>
-    <w:p>
-      <w:pPr>
-        <w:rPr>
-          <w:lang/>
-        </w:rPr>
-      </w:pPr>
-    </w:p>
+    <w:p/>
     <w:p>
       <w:pPr>
         <w:pStyle w:val="Heading2"/>
@@ -4446,22 +4280,15 @@
           <w:ilvl w:val="0"/>
           <w:numId w:val="44"/>
         </w:numPr>
-        <w:rPr>
-          <w:lang/>
-        </w:rPr>
       </w:pPr>
       <w:r>
         <w:rPr>
           <w:b/>
           <w:bCs/>
-          <w:lang/>
         </w:rPr>
         <w:t>Video/Animation Limitations</w:t>
       </w:r>
       <w:r>
-        <w:rPr>
-          <w:lang/>
-        </w:rPr>
         <w:t>:</w:t>
       </w:r>
     </w:p>
@@ -4474,22 +4301,15 @@
         <w:tabs>
           <w:tab w:val="num" w:pos="720"/>
         </w:tabs>
-        <w:rPr>
-          <w:lang/>
-        </w:rPr>
       </w:pPr>
       <w:r>
         <w:rPr>
           <w:b/>
           <w:bCs/>
-          <w:lang/>
         </w:rPr>
         <w:t xml:space="preserve">Problem: </w:t>
       </w:r>
       <w:r>
-        <w:rPr>
-          <w:lang/>
-        </w:rPr>
         <w:t>Combining videos or animations with free models within an acceptable waiting time (under 2 minutes) is not feasible.</w:t>
       </w:r>
     </w:p>
@@ -4502,22 +4322,15 @@
         <w:tabs>
           <w:tab w:val="num" w:pos="720"/>
         </w:tabs>
-        <w:rPr>
-          <w:lang/>
-        </w:rPr>
       </w:pPr>
       <w:r>
         <w:rPr>
           <w:b/>
           <w:bCs/>
-          <w:lang/>
         </w:rPr>
         <w:t>Solution</w:t>
       </w:r>
       <w:r>
-        <w:rPr>
-          <w:lang/>
-        </w:rPr>
         <w:t>: Engage the customer in discussions about their preferences:</w:t>
       </w:r>
     </w:p>
@@ -4530,14 +4343,8 @@
         <w:tabs>
           <w:tab w:val="num" w:pos="1440"/>
         </w:tabs>
-        <w:rPr>
-          <w:lang/>
-        </w:rPr>
-      </w:pPr>
-      <w:r>
-        <w:rPr>
-          <w:lang/>
-        </w:rPr>
+      </w:pPr>
+      <w:r>
         <w:t>Free models → static images.</w:t>
       </w:r>
     </w:p>
@@ -4550,14 +4357,8 @@
         <w:tabs>
           <w:tab w:val="num" w:pos="1440"/>
         </w:tabs>
-        <w:rPr>
-          <w:lang/>
-        </w:rPr>
-      </w:pPr>
-      <w:r>
-        <w:rPr>
-          <w:lang/>
-        </w:rPr>
+      </w:pPr>
+      <w:r>
         <w:t>Paid models → animations or videos.</w:t>
       </w:r>
     </w:p>
@@ -4570,32 +4371,19 @@
         <w:tabs>
           <w:tab w:val="num" w:pos="720"/>
         </w:tabs>
-        <w:rPr>
-          <w:lang/>
-        </w:rPr>
       </w:pPr>
       <w:r>
         <w:rPr>
           <w:b/>
           <w:bCs/>
-          <w:lang/>
         </w:rPr>
         <w:t>Outcome</w:t>
       </w:r>
       <w:r>
-        <w:rPr>
-          <w:lang/>
-        </w:rPr>
         <w:t>: Default to static images unless the customer opts for paid solutions.</w:t>
       </w:r>
     </w:p>
-    <w:p>
-      <w:pPr>
-        <w:rPr>
-          <w:lang/>
-        </w:rPr>
-      </w:pPr>
-    </w:p>
+    <w:p/>
     <w:p>
       <w:pPr>
         <w:pStyle w:val="ListParagraph"/>
@@ -4606,14 +4394,12 @@
         <w:rPr>
           <w:b/>
           <w:bCs/>
-          <w:lang/>
         </w:rPr>
       </w:pPr>
       <w:r>
         <w:rPr>
           <w:b/>
           <w:bCs/>
-          <w:lang/>
         </w:rPr>
         <w:t>Waiting time limitations:</w:t>
       </w:r>
@@ -4628,7 +4414,6 @@
         <w:rPr>
           <w:b/>
           <w:bCs/>
-          <w:lang/>
         </w:rPr>
       </w:pPr>
       <w:r>
@@ -4652,21 +4437,16 @@
         <w:rPr>
           <w:b/>
           <w:bCs/>
-          <w:lang/>
         </w:rPr>
       </w:pPr>
       <w:r>
         <w:rPr>
           <w:b/>
           <w:bCs/>
-          <w:lang/>
         </w:rPr>
         <w:t>Solutions</w:t>
       </w:r>
       <w:r>
-        <w:rPr>
-          <w:lang/>
-        </w:rPr>
         <w:t xml:space="preserve">: </w:t>
       </w:r>
     </w:p>
@@ -4677,14 +4457,8 @@
           <w:ilvl w:val="1"/>
           <w:numId w:val="40"/>
         </w:numPr>
-        <w:rPr>
-          <w:lang/>
-        </w:rPr>
-      </w:pPr>
-      <w:r>
-        <w:rPr>
-          <w:lang/>
-        </w:rPr>
+      </w:pPr>
+      <w:r>
         <w:t>Switch to running smaller, faster models directly on our machines.</w:t>
       </w:r>
     </w:p>
@@ -4698,13 +4472,9 @@
         <w:rPr>
           <w:b/>
           <w:bCs/>
-          <w:lang/>
-        </w:rPr>
-      </w:pPr>
-      <w:r>
-        <w:rPr>
-          <w:lang/>
-        </w:rPr>
+        </w:rPr>
+      </w:pPr>
+      <w:r>
         <w:t>Pre-generate a library of images featuring famous landmarks.</w:t>
       </w:r>
     </w:p>
@@ -4718,14 +4488,12 @@
         <w:rPr>
           <w:b/>
           <w:bCs/>
-          <w:lang/>
         </w:rPr>
       </w:pPr>
       <w:r>
         <w:rPr>
           <w:b/>
           <w:bCs/>
-          <w:lang/>
         </w:rPr>
         <w:t>Outcome</w:t>
       </w:r>
@@ -4733,7 +4501,6 @@
         <w:rPr>
           <w:b/>
           <w:bCs/>
-          <w:lang/>
         </w:rPr>
         <w:t xml:space="preserve">: </w:t>
       </w:r>
@@ -4746,14 +4513,12 @@
         <w:rPr>
           <w:b/>
           <w:bCs/>
-          <w:lang/>
         </w:rPr>
       </w:pPr>
       <w:r>
         <w:rPr>
           <w:b/>
           <w:bCs/>
-          <w:lang/>
         </w:rPr>
         <w:br w:type="page"/>
       </w:r>
@@ -4763,7 +4528,6 @@
         <w:rPr>
           <w:b/>
           <w:bCs/>
-          <w:lang/>
         </w:rPr>
       </w:pPr>
     </w:p>
@@ -4774,22 +4538,15 @@
           <w:ilvl w:val="0"/>
           <w:numId w:val="44"/>
         </w:numPr>
-        <w:rPr>
-          <w:lang/>
-        </w:rPr>
       </w:pPr>
       <w:r>
         <w:rPr>
           <w:b/>
           <w:bCs/>
-          <w:lang/>
         </w:rPr>
         <w:t>AI Accuracy Concerns</w:t>
       </w:r>
       <w:r>
-        <w:rPr>
-          <w:lang/>
-        </w:rPr>
         <w:t>:</w:t>
       </w:r>
     </w:p>
@@ -4802,22 +4559,15 @@
         <w:tabs>
           <w:tab w:val="num" w:pos="720"/>
         </w:tabs>
-        <w:rPr>
-          <w:lang/>
-        </w:rPr>
       </w:pPr>
       <w:r>
         <w:rPr>
           <w:b/>
           <w:bCs/>
-          <w:lang/>
         </w:rPr>
         <w:t xml:space="preserve">Problem: </w:t>
       </w:r>
       <w:r>
-        <w:rPr>
-          <w:lang/>
-        </w:rPr>
         <w:t>AI-generated images may lack precision and cannot replace traditional educational study trips.</w:t>
       </w:r>
     </w:p>
@@ -4830,22 +4580,15 @@
         <w:tabs>
           <w:tab w:val="num" w:pos="720"/>
         </w:tabs>
-        <w:rPr>
-          <w:lang/>
-        </w:rPr>
       </w:pPr>
       <w:r>
         <w:rPr>
           <w:b/>
           <w:bCs/>
-          <w:lang/>
         </w:rPr>
         <w:t>Solution</w:t>
       </w:r>
       <w:r>
-        <w:rPr>
-          <w:lang/>
-        </w:rPr>
         <w:t>: Redefine the educational concept through collaboration with the customer:</w:t>
       </w:r>
     </w:p>
@@ -4858,22 +4601,15 @@
         <w:tabs>
           <w:tab w:val="num" w:pos="1440"/>
         </w:tabs>
-        <w:rPr>
-          <w:lang/>
-        </w:rPr>
       </w:pPr>
       <w:r>
         <w:rPr>
           <w:b/>
           <w:bCs/>
-          <w:lang/>
         </w:rPr>
         <w:t>Creative Engagement</w:t>
       </w:r>
       <w:r>
-        <w:rPr>
-          <w:lang/>
-        </w:rPr>
         <w:t>: Use AI-generated images to spark creativity and curiosity in children through interactive scenarios.</w:t>
       </w:r>
     </w:p>
@@ -4886,22 +4622,15 @@
         <w:tabs>
           <w:tab w:val="num" w:pos="1440"/>
         </w:tabs>
-        <w:rPr>
-          <w:lang/>
-        </w:rPr>
       </w:pPr>
       <w:r>
         <w:rPr>
           <w:b/>
           <w:bCs/>
-          <w:lang/>
         </w:rPr>
         <w:t>Critical Thinking Development</w:t>
       </w:r>
       <w:r>
-        <w:rPr>
-          <w:lang/>
-        </w:rPr>
         <w:t>: Foster critical thinking and digital literacy by teaching children to analyze and evaluate AI-generated content, guided by educators.</w:t>
       </w:r>
     </w:p>
@@ -4912,9 +4641,6 @@
           <w:ilvl w:val="0"/>
           <w:numId w:val="43"/>
         </w:numPr>
-        <w:rPr>
-          <w:lang/>
-        </w:rPr>
       </w:pPr>
       <w:r>
         <w:rPr>
@@ -4927,13 +4653,7 @@
         <w:t>: AI becomes a tool for interactive, critical, and creative learning rather than a direct study trip replacement.</w:t>
       </w:r>
     </w:p>
-    <w:p>
-      <w:pPr>
-        <w:rPr>
-          <w:lang/>
-        </w:rPr>
-      </w:pPr>
-    </w:p>
+    <w:p/>
     <w:p>
       <w:pPr>
         <w:pStyle w:val="ListParagraph"/>
@@ -4941,22 +4661,15 @@
           <w:ilvl w:val="0"/>
           <w:numId w:val="44"/>
         </w:numPr>
-        <w:rPr>
-          <w:lang/>
-        </w:rPr>
       </w:pPr>
       <w:r>
         <w:rPr>
           <w:b/>
           <w:bCs/>
-          <w:lang/>
         </w:rPr>
         <w:t>Inaccurate voice recognition</w:t>
       </w:r>
       <w:r>
-        <w:rPr>
-          <w:lang/>
-        </w:rPr>
         <w:t>:</w:t>
       </w:r>
     </w:p>
@@ -4967,22 +4680,15 @@
           <w:ilvl w:val="0"/>
           <w:numId w:val="46"/>
         </w:numPr>
-        <w:rPr>
-          <w:lang/>
-        </w:rPr>
       </w:pPr>
       <w:r>
         <w:rPr>
           <w:b/>
           <w:bCs/>
-          <w:lang/>
         </w:rPr>
         <w:t>Problem</w:t>
       </w:r>
       <w:r>
-        <w:rPr>
-          <w:lang/>
-        </w:rPr>
         <w:t>: The website's voice input tool sometimes misinterpreted user speech before sending it to the API.</w:t>
       </w:r>
     </w:p>
@@ -4993,50 +4699,35 @@
           <w:ilvl w:val="0"/>
           <w:numId w:val="46"/>
         </w:numPr>
-        <w:rPr>
-          <w:lang/>
-        </w:rPr>
       </w:pPr>
       <w:r>
         <w:rPr>
           <w:b/>
           <w:bCs/>
-          <w:lang/>
         </w:rPr>
         <w:t>Solution</w:t>
       </w:r>
       <w:r>
-        <w:rPr>
-          <w:lang/>
-        </w:rPr>
         <w:t>: Add "</w:t>
       </w:r>
       <w:r>
         <w:rPr>
           <w:i/>
           <w:iCs/>
-          <w:lang/>
         </w:rPr>
         <w:t>Confirm</w:t>
       </w:r>
       <w:r>
-        <w:rPr>
-          <w:lang/>
-        </w:rPr>
         <w:t>" and "</w:t>
       </w:r>
       <w:r>
         <w:rPr>
           <w:i/>
           <w:iCs/>
-          <w:lang/>
         </w:rPr>
         <w:t>Deny</w:t>
       </w:r>
       <w:r>
-        <w:rPr>
-          <w:lang/>
-        </w:rPr>
         <w:t>" buttons for users to review their recorded speech.</w:t>
       </w:r>
     </w:p>
@@ -5051,7 +4742,6 @@
           <w:rFonts w:ascii="Times New Roman" w:eastAsia="Times New Roman" w:hAnsi="Times New Roman" w:cs="Times New Roman"/>
           <w:color w:val="auto"/>
           <w:kern w:val="0"/>
-          <w:lang/>
           <w14:ligatures w14:val="none"/>
         </w:rPr>
       </w:pPr>
@@ -5059,7 +4749,6 @@
         <w:rPr>
           <w:b/>
           <w:bCs/>
-          <w:lang/>
         </w:rPr>
         <w:t>Outcome</w:t>
       </w:r>
@@ -5068,28 +4757,16 @@
           <w:rFonts w:ascii="Times New Roman" w:eastAsia="Times New Roman" w:hAnsi="Times New Roman" w:cs="Times New Roman"/>
           <w:color w:val="auto"/>
           <w:kern w:val="0"/>
-          <w:lang/>
           <w14:ligatures w14:val="none"/>
         </w:rPr>
         <w:t xml:space="preserve">: </w:t>
       </w:r>
       <w:r>
-        <w:rPr>
-          <w:lang/>
-        </w:rPr>
         <w:t>Users can ensure their prompt is correct before generating an image, reducing errors.</w:t>
       </w:r>
     </w:p>
     <w:p>
-      <w:pPr>
-        <w:rPr>
-          <w:lang/>
-        </w:rPr>
-      </w:pPr>
-      <w:r>
-        <w:rPr>
-          <w:lang/>
-        </w:rPr>
+      <w:r>
         <w:br w:type="page"/>
       </w:r>
     </w:p>
@@ -5958,7 +5635,15 @@
         <w:t>r</w:t>
       </w:r>
       <w:r>
-        <w:t>oom. The images are sent over the network and then used to update the skybox of the environment. This means that the environment can change in real-time based on the user's input.</w:t>
+        <w:t xml:space="preserve">oom. The images are sent over the network and then used to update the skybox of the environment. </w:t>
+      </w:r>
+    </w:p>
+    <w:p>
+      <w:r>
+        <w:t xml:space="preserve">The skybox is a giant sphere, with the centre point being in the middle of the immersive room. When we say we update the skybox, we mean that we overlay an image on the inside of this sphere. </w:t>
+      </w:r>
+      <w:r>
+        <w:t>This means that the environment can change in real-time based on the user's input.</w:t>
       </w:r>
     </w:p>
     <w:p/>
@@ -15270,6 +14955,10 @@
 </file>
 
 <file path=customXml/item1.xml><?xml version="1.0" encoding="utf-8"?>
+<b:Sources xmlns:b="http://schemas.openxmlformats.org/officeDocument/2006/bibliography" xmlns="http://schemas.openxmlformats.org/officeDocument/2006/bibliography" SelectedStyle="\APASixthEditionOfficeOnline.xsl" StyleName="APA" Version="6"/>
+</file>
+
+<file path=customXml/item2.xml><?xml version="1.0" encoding="utf-8"?>
 <ct:contentTypeSchema xmlns:ct="http://schemas.microsoft.com/office/2006/metadata/contentType" xmlns:ma="http://schemas.microsoft.com/office/2006/metadata/properties/metaAttributes" ct:_="" ma:_="" ma:contentTypeName="Document" ma:contentTypeID="0x01010018DC116B99092D4D8A5F6B343143F90C" ma:contentTypeVersion="11" ma:contentTypeDescription="Een nieuw document maken." ma:contentTypeScope="" ma:versionID="11babd701b95b9de7e78c95a8b5dfaf8">
   <xsd:schema xmlns:xsd="http://www.w3.org/2001/XMLSchema" xmlns:xs="http://www.w3.org/2001/XMLSchema" xmlns:p="http://schemas.microsoft.com/office/2006/metadata/properties" xmlns:ns3="23a67101-b336-418c-b344-15be425e7264" targetNamespace="http://schemas.microsoft.com/office/2006/metadata/properties" ma:root="true" ma:fieldsID="8257eb286c57542a8453cd2a6b9bc064" ns3:_="">
     <xsd:import namespace="23a67101-b336-418c-b344-15be425e7264"/>
@@ -15457,19 +15146,7 @@
 </ct:contentTypeSchema>
 </file>
 
-<file path=customXml/item2.xml><?xml version="1.0" encoding="utf-8"?>
-<b:Sources xmlns:b="http://schemas.openxmlformats.org/officeDocument/2006/bibliography" xmlns="http://schemas.openxmlformats.org/officeDocument/2006/bibliography" SelectedStyle="\APASixthEditionOfficeOnline.xsl" StyleName="APA" Version="6"/>
-</file>
-
 <file path=customXml/item3.xml><?xml version="1.0" encoding="utf-8"?>
-<p:properties xmlns:p="http://schemas.microsoft.com/office/2006/metadata/properties" xmlns:xsi="http://www.w3.org/2001/XMLSchema-instance" xmlns:pc="http://schemas.microsoft.com/office/infopath/2007/PartnerControls">
-  <documentManagement>
-    <_activity xmlns="23a67101-b336-418c-b344-15be425e7264" xsi:nil="true"/>
-  </documentManagement>
-</p:properties>
-</file>
-
-<file path=customXml/item4.xml><?xml version="1.0" encoding="utf-8"?>
 <?mso-contentType ?>
 <FormTemplates xmlns="http://schemas.microsoft.com/sharepoint/v3/contenttype/forms">
   <Display>DocumentLibraryForm</Display>
@@ -15478,7 +15155,23 @@
 </FormTemplates>
 </file>
 
+<file path=customXml/item4.xml><?xml version="1.0" encoding="utf-8"?>
+<p:properties xmlns:p="http://schemas.microsoft.com/office/2006/metadata/properties" xmlns:xsi="http://www.w3.org/2001/XMLSchema-instance" xmlns:pc="http://schemas.microsoft.com/office/infopath/2007/PartnerControls">
+  <documentManagement>
+    <_activity xmlns="23a67101-b336-418c-b344-15be425e7264" xsi:nil="true"/>
+  </documentManagement>
+</p:properties>
+</file>
+
 <file path=customXml/itemProps1.xml><?xml version="1.0" encoding="utf-8"?>
+<ds:datastoreItem xmlns:ds="http://schemas.openxmlformats.org/officeDocument/2006/customXml" ds:itemID="{950EFBE2-D04B-487D-ACE8-95A0899E4AE5}">
+  <ds:schemaRefs>
+    <ds:schemaRef ds:uri="http://schemas.openxmlformats.org/officeDocument/2006/bibliography"/>
+  </ds:schemaRefs>
+</ds:datastoreItem>
+</file>
+
+<file path=customXml/itemProps2.xml><?xml version="1.0" encoding="utf-8"?>
 <ds:datastoreItem xmlns:ds="http://schemas.openxmlformats.org/officeDocument/2006/customXml" ds:itemID="{1F906CB3-1E4D-49FB-B35E-58CDAE94727B}">
   <ds:schemaRefs>
     <ds:schemaRef ds:uri="http://schemas.microsoft.com/office/2006/metadata/contentType"/>
@@ -15496,15 +15189,15 @@
 </ds:datastoreItem>
 </file>
 
-<file path=customXml/itemProps2.xml><?xml version="1.0" encoding="utf-8"?>
-<ds:datastoreItem xmlns:ds="http://schemas.openxmlformats.org/officeDocument/2006/customXml" ds:itemID="{950EFBE2-D04B-487D-ACE8-95A0899E4AE5}">
+<file path=customXml/itemProps3.xml><?xml version="1.0" encoding="utf-8"?>
+<ds:datastoreItem xmlns:ds="http://schemas.openxmlformats.org/officeDocument/2006/customXml" ds:itemID="{AC539E09-CDEA-4A8A-A36A-26E96334EAC3}">
   <ds:schemaRefs>
-    <ds:schemaRef ds:uri="http://schemas.openxmlformats.org/officeDocument/2006/bibliography"/>
+    <ds:schemaRef ds:uri="http://schemas.microsoft.com/sharepoint/v3/contenttype/forms"/>
   </ds:schemaRefs>
 </ds:datastoreItem>
 </file>
 
-<file path=customXml/itemProps3.xml><?xml version="1.0" encoding="utf-8"?>
+<file path=customXml/itemProps4.xml><?xml version="1.0" encoding="utf-8"?>
 <ds:datastoreItem xmlns:ds="http://schemas.openxmlformats.org/officeDocument/2006/customXml" ds:itemID="{65AE7EF0-0F62-4347-BDA6-727625CEADD1}">
   <ds:schemaRefs>
     <ds:schemaRef ds:uri="http://schemas.microsoft.com/office/2006/metadata/properties"/>
@@ -15512,12 +15205,4 @@
     <ds:schemaRef ds:uri="23a67101-b336-418c-b344-15be425e7264"/>
   </ds:schemaRefs>
 </ds:datastoreItem>
-</file>
-
-<file path=customXml/itemProps4.xml><?xml version="1.0" encoding="utf-8"?>
-<ds:datastoreItem xmlns:ds="http://schemas.openxmlformats.org/officeDocument/2006/customXml" ds:itemID="{AC539E09-CDEA-4A8A-A36A-26E96334EAC3}">
-  <ds:schemaRefs>
-    <ds:schemaRef ds:uri="http://schemas.microsoft.com/sharepoint/v3/contenttype/forms"/>
-  </ds:schemaRefs>
-</ds:datastoreItem>
 </file>
</xml_diff>